<commit_message>
feat: stack React 18, Vite, TypeScript, ConfigCat SDK y render.yaml con informe oficial actualizado
</commit_message>
<xml_diff>
--- a/INFORME_TALLER_6_CONTINUOUS_DEPLOYMENT.docx
+++ b/INFORME_TALLER_6_CONTINUOUS_DEPLOYMENT.docx
@@ -4,7 +4,7 @@
   <w:body>
     <w:p>
       <w:pPr>
-        <w:spacing w:after="800"/>
+        <w:spacing w:after="700"/>
         <w:jc w:val="center"/>
       </w:pPr>
       <w:r>
@@ -23,7 +23,7 @@
     </w:p>
     <w:p>
       <w:pPr>
-        <w:spacing w:after="400"/>
+        <w:spacing w:after="360"/>
         <w:jc w:val="center"/>
       </w:pPr>
       <w:r>
@@ -31,16 +31,16 @@
           <w:rFonts w:ascii="Arial" w:hAnsi="Arial"/>
           <w:b/>
           <w:color w:val="0066CC"/>
-          <w:sz w:val="34"/>
+          <w:sz w:val="32"/>
         </w:rPr>
-        <w:t>TALLER 6:</w:t>
+        <w:t>INFORME TÉCNICO - TALLER 6:</w:t>
         <w:br/>
-        <w:t>SPRINT REVIEW, RETROSPECTIVE Y LIBERACIÓN SEGURA EN CONTINUOUS DEPLOYMENT</w:t>
+        <w:t>CONTINUOUS DEPLOYMENT, SPRINT REVIEW &amp; RETROSPECTIVE</w:t>
       </w:r>
     </w:p>
     <w:p>
       <w:pPr>
-        <w:spacing w:after="1600"/>
+        <w:spacing w:after="1400"/>
         <w:jc w:val="center"/>
       </w:pPr>
       <w:r>
@@ -48,11 +48,13 @@
           <w:rFonts w:ascii="Arial" w:hAnsi="Arial"/>
           <w:i/>
           <w:color w:val="46505A"/>
-          <w:sz w:val="22"/>
+          <w:sz w:val="21"/>
         </w:rPr>
-        <w:t>Resolución de Caso Real: 'La funcionalidad de Pagos Express ya está en main, pero nadie se atreve a activarla'</w:t>
+        <w:t>Servicio de Feature Flags: ConfigCat</w:t>
         <w:br/>
-        <w:t>Adopción de Trunk-Based Development, ConfigCat Feature Flags y Auto-Deploy en Render</w:t>
+        <w:t>Stack Tecnológico: React 18, Vite, TypeScript, ConfigCat SDK, Render</w:t>
+        <w:br/>
+        <w:t>Caso Técnico: 'Pagos Express en Liquidación de Trámites Catastrales'</w:t>
       </w:r>
     </w:p>
     <w:p>
@@ -94,18 +96,126 @@
     <w:p>
       <w:pPr>
         <w:pStyle w:val="Heading1"/>
-        <w:spacing w:before="300" w:after="160"/>
       </w:pPr>
       <w:r>
-        <w:t>1. Apertura y Conexión con el Nuevo Flujo</w:t>
+        <w:t>1. INTRODUCCIÓN Y OBJETIVO</w:t>
       </w:r>
     </w:p>
     <w:p>
       <w:pPr>
-        <w:spacing w:after="200"/>
+        <w:spacing w:after="240"/>
       </w:pPr>
       <w:r>
-        <w:t>Con la consolidación de nuestro pipeline de Continuous Deployment (CD), cada integración exitosa en la rama principal (main) se compila, prueba y despliega automáticamente a producción en Render. Asimismo, disponemos de ConfigCat para proteger funcionalidades incompletas o en fase de prueba mediante Feature Flags. En este contexto, surge la necesidad ineludible de transformar radicalmente las ceremonias tradicionales de Scrum para adaptarlas a este nuevo ritmo continuo.</w:t>
+        <w:t>El presente informe documenta la adaptación práctica de las ceremonias ágiles de Scrum (Sprint Review y Sprint Retrospective) al modelo de Continuous Deployment (CD) y Trunk-Based Development (TBD), resolviendo el caso técnico de 'Pagos Express' mediante el desacople entre despliegue y liberación con Feature Flags y una estrategia de liberación controlada.</w:t>
+      </w:r>
+    </w:p>
+    <w:p>
+      <w:pPr>
+        <w:pStyle w:val="Heading1"/>
+      </w:pPr>
+      <w:r>
+        <w:t>2. ADAPTACIÓN DEL SPRINT REVIEW A CONTINUOUS DEPLOYMENT</w:t>
+      </w:r>
+    </w:p>
+    <w:p>
+      <w:pPr>
+        <w:pStyle w:val="Heading2"/>
+      </w:pPr>
+      <w:r>
+        <w:t>2.1 Principios Comparativos</w:t>
+      </w:r>
+    </w:p>
+    <w:p>
+      <w:r>
+        <w:t>• Review Clásico: Demostración de un incremento acumulado al final de una iteración de dos semanas; enfoque de 'todo o nada' habitualmente presentado en local o staging; feedback tardío centrado en 'qué construimos'.</w:t>
+        <w:br/>
+        <w:br/>
+        <w:t>• Review en CD + TBD: Demostración de valor incremental que ya reside en el entorno de producción real (Render). Las funcionalidades están desacopladas mediante Feature Toggles (ConfigCat), permitiendo validación empírica y feedback continuo centrado en 'qué valor e impacto recibieron los usuarios'.</w:t>
+      </w:r>
+    </w:p>
+    <w:p>
+      <w:pPr>
+        <w:pStyle w:val="Heading2"/>
+      </w:pPr>
+      <w:r>
+        <w:t>2.2 Ficha Técnica de Demostración (Caso: Pagos Express)</w:t>
+      </w:r>
+    </w:p>
+    <w:p>
+      <w:r>
+        <w:t>• Problema Resuelto: Elimina la fricción y abandono en la liquidación de trámites catastrales mediante un checkout rápido de 1 clic con firma digital autorizada, evitando formularios bancarios repetitivos.</w:t>
+        <w:br/>
+        <w:br/>
+        <w:t>• Estado en Producción: Código integrado a la rama main y desplegado en Render, aislado detrás del flag pagos-express-v1 (en estado OFF).</w:t>
+        <w:br/>
+        <w:br/>
+        <w:t>• Flujo de la Demo en Vivo:</w:t>
+        <w:br/>
+        <w:t xml:space="preserve">  1. Estado OFF: Se proyecta la aplicación en Render mostrando la pasarela estándar ('Completar formulario y Pagar') con el flag inactivo.</w:t>
+        <w:br/>
+        <w:t xml:space="preserve">  2. Conmutación: Se conmuta el toggle pagos-express-v1 a ON en la consola de ConfigCat y se publica el cambio.</w:t>
+        <w:br/>
+        <w:t xml:space="preserve">  3. Estado ON: Sin requerir nuevo commit, compilación ni redespliegue, la interfaz actualiza dinámicamente el componente a 'Pagar en 1 Clic con Pagos Express'.</w:t>
+        <w:br/>
+        <w:br/>
+        <w:t>• Métricas de Éxito: Reducción del tiempo de liquidación (de 3 minutos a menos de 10 segundos), tasa de conversión en pasarela y tasa de error técnico inferior al 0.5%.</w:t>
+        <w:br/>
+        <w:br/>
+        <w:t>• Pregunta de Validación al PO/Stakeholders: “¿La confirmación en un clic resuelve la necesidad del ciudadano antes de abrir el tráfico al 100%?”</w:t>
+      </w:r>
+    </w:p>
+    <w:p>
+      <w:pPr>
+        <w:pStyle w:val="Heading1"/>
+      </w:pPr>
+      <w:r>
+        <w:t>3. ADAPTACIÓN DE LA SPRINT RETROSPECTIVE</w:t>
+      </w:r>
+    </w:p>
+    <w:p>
+      <w:pPr>
+        <w:pStyle w:val="Heading2"/>
+      </w:pPr>
+      <w:r>
+        <w:t>3.1 Nuevos Focos de Inspección Obligatoria</w:t>
+      </w:r>
+    </w:p>
+    <w:p>
+      <w:r>
+        <w:t>En Continuous Deployment, la Retrospectiva deja de ser una dinámica abstracta y analiza métricas técnicas de flujo:</w:t>
+        <w:br/>
+        <w:t>• Salud del Pipeline: Tasa de builds rotos, tiempos de auto-deploy, estabilidad de health checks y presencia de rollbacks.</w:t>
+        <w:br/>
+        <w:t>• Disciplina TBD: Integraciones diarias a main, tiempo de vida de ramas (&lt; 24 horas) e higiene/retiro de feature flags.</w:t>
+        <w:br/>
+        <w:t>• Flujo de Valor: Lead Time for Changes y tiempo efectivo en que el usuario recibe valor.</w:t>
+      </w:r>
+    </w:p>
+    <w:p>
+      <w:pPr>
+        <w:pStyle w:val="Heading2"/>
+      </w:pPr>
+      <w:r>
+        <w:t>3.2 Diagnóstico del Caso (Sprint Retrospective)</w:t>
+      </w:r>
+    </w:p>
+    <w:p>
+      <w:r>
+        <w:t>• Salud del Pipeline: Se presentó un fallo de health check por 11 minutos durante el último deploy automático que requirió rollback manual; existencia de tests intermitentes (flaky tests) en el CI.</w:t>
+        <w:br/>
+        <w:t>• Disciplina TBD: Se redujo el ritmo a solo 4 integraciones en el sprint; una rama permaneció abierta 4 días para sortear el test flaky del CI.</w:t>
+        <w:br/>
+        <w:t>• Higiene de Toggles: Existen 3 feature toggles con más de 45 días de vida sin retirar del código base.</w:t>
+        <w:br/>
+        <w:t>• Flujo de Valor: Presión comercial por activar el toggle al 20% en viernes sin instrumentar métricas de error de pasarela ni conversión.</w:t>
+      </w:r>
+    </w:p>
+    <w:p>
+      <w:pPr>
+        <w:pStyle w:val="Heading2"/>
+      </w:pPr>
+      <w:r>
+        <w:t>3.3 Matriz de Retrospectiva (Estructura Miro)</w:t>
       </w:r>
     </w:p>
     <w:tbl>
@@ -115,101 +225,14 @@
         <w:tblLook w:firstColumn="1" w:firstRow="1" w:lastColumn="0" w:lastRow="0" w:noHBand="0" w:noVBand="1" w:val="04A0"/>
       </w:tblPr>
       <w:tblGrid>
-        <w:gridCol w:w="9360"/>
+        <w:gridCol w:w="3120"/>
+        <w:gridCol w:w="3120"/>
+        <w:gridCol w:w="3120"/>
       </w:tblGrid>
       <w:tr>
         <w:tc>
           <w:tcPr>
-            <w:tcW w:type="dxa" w:w="9360"/>
-            <w:shd w:fill="F0F4F8"/>
-            <w:tcMar>
-              <w:top w:w="140" w:type="dxa"/>
-              <w:bottom w:w="140" w:type="dxa"/>
-              <w:left w:w="200" w:type="dxa"/>
-              <w:right w:w="180" w:type="dxa"/>
-            </w:tcMar>
-            <w:tcBorders>
-              <w:top w:val="none"/>
-              <w:left w:val="single" w:sz="24" w:space="0" w:color="0066CC"/>
-              <w:bottom w:val="none"/>
-              <w:right w:val="none"/>
-            </w:tcBorders>
-          </w:tcPr>
-          <w:p>
-            <w:pPr>
-              <w:spacing w:before="40" w:after="40"/>
-            </w:pPr>
-            <w:r>
-              <w:rPr>
-                <w:rFonts w:ascii="Arial" w:hAnsi="Arial"/>
-                <w:b/>
-                <w:color w:val="0A2540"/>
-                <w:sz w:val="20"/>
-              </w:rPr>
-              <w:t xml:space="preserve">📌 CAMBIO DE PARADIGMA CENTRAL: </w:t>
-            </w:r>
-            <w:r>
-              <w:rPr>
-                <w:rFonts w:ascii="Arial" w:hAnsi="Arial"/>
-                <w:color w:val="28323C"/>
-                <w:sz w:val="20"/>
-              </w:rPr>
-              <w:t>¿Cómo cambian el Sprint Review y la Retrospectiva cuando desplegamos varias veces por semana? El Review deja de ser una entrega de código estático para convertirse en una demostración científica de valor en producción, mientras que la Retrospectiva pasa de ser una conversación subjetiva a una rigurosa auditoría de la salud del pipeline y de la disciplina TBD.</w:t>
-            </w:r>
-          </w:p>
-        </w:tc>
-      </w:tr>
-    </w:tbl>
-    <w:p/>
-    <w:p>
-      <w:pPr>
-        <w:pStyle w:val="Heading2"/>
-      </w:pPr>
-      <w:r>
-        <w:t>Pregunta de Arranque del Taller</w:t>
-      </w:r>
-    </w:p>
-    <w:p>
-      <w:r>
-        <w:t>“¿Qué parte del Review o de la Retro actual se siente más ‘antigua’ o poco útil con este nuevo flujo?”</w:t>
-        <w:br/>
-        <w:br/>
-        <w:t>1. En el Sprint Review: Se siente obsoleto esperar 14 días para mostrar un incremento empaquetado en una máquina local. Si el software ya se despliega continuamente, el feedback diferido 'todo o nada' carece de sentido y destruye la agilidad.</w:t>
-        <w:br/>
-        <w:t>2. En la Sprint Retrospective: Se siente anticuado enfocarse exclusivamente en percepciones interpersonales o estimaciones de puntos de historia, ignorando los datos reales de ingeniería: tiempo de vida de las ramas, fallos en el pipeline de CI/CD, duraciones de despliegue y deuda técnica de toggles.</w:t>
-      </w:r>
-    </w:p>
-    <w:p>
-      <w:pPr>
-        <w:pStyle w:val="Heading1"/>
-      </w:pPr>
-      <w:r>
-        <w:t>2. Diagnóstico y Resolución del Caso de Estudio</w:t>
-      </w:r>
-    </w:p>
-    <w:p>
-      <w:r>
-        <w:t>Título del Caso: “La funcionalidad de ‘Pagos Express’ ya está en main, pero nadie se atreve a activarla”</w:t>
-        <w:br/>
-        <w:t>Contexto: El equipo completó la historia 'Pagos Express con un solo clic', integrada a main hace 9 días bajo el flag 'pagos-express-v1' (OFF al 100%). A continuación, se presenta la matriz de análisis y decisiones tomadas frente a los 7 hechos problemáticos identificados:</w:t>
-      </w:r>
-    </w:p>
-    <w:tbl>
-      <w:tblPr>
-        <w:tblW w:type="auto" w:w="0"/>
-        <w:jc w:val="center"/>
-        <w:tblLook w:firstColumn="1" w:firstRow="1" w:lastColumn="0" w:lastRow="0" w:noHBand="0" w:noVBand="1" w:val="04A0"/>
-      </w:tblPr>
-      <w:tblGrid>
-        <w:gridCol w:w="2340"/>
-        <w:gridCol w:w="2340"/>
-        <w:gridCol w:w="2340"/>
-        <w:gridCol w:w="2340"/>
-      </w:tblGrid>
-      <w:tr>
-        <w:tc>
-          <w:tcPr>
-            <w:tcW w:type="dxa" w:w="720"/>
+            <w:tcW w:type="dxa" w:w="3024"/>
             <w:shd w:fill="0A2540"/>
             <w:tcMar>
               <w:top w:w="120" w:type="dxa"/>
@@ -229,7 +252,7 @@
                 <w:color w:val="FFFFFF"/>
                 <w:sz w:val="19"/>
               </w:rPr>
-              <w:t>#</w:t>
+              <w:t>🟢 Lo que funcionó bien</w:t>
             </w:r>
           </w:p>
         </w:tc>
@@ -255,771 +278,7 @@
                 <w:color w:val="FFFFFF"/>
                 <w:sz w:val="19"/>
               </w:rPr>
-              <w:t>Hecho Problemático</w:t>
-            </w:r>
-          </w:p>
-        </w:tc>
-        <w:tc>
-          <w:tcPr>
-            <w:tcW w:type="dxa" w:w="2592"/>
-            <w:shd w:fill="0A2540"/>
-            <w:tcMar>
-              <w:top w:w="120" w:type="dxa"/>
-              <w:bottom w:w="120" w:type="dxa"/>
-              <w:left w:w="140" w:type="dxa"/>
-              <w:right w:w="140" w:type="dxa"/>
-            </w:tcMar>
-          </w:tcPr>
-          <w:p>
-            <w:pPr>
-              <w:jc w:val="center"/>
-            </w:pPr>
-            <w:r>
-              <w:rPr>
-                <w:rFonts w:ascii="Arial" w:hAnsi="Arial"/>
-                <w:b/>
-                <w:color w:val="FFFFFF"/>
-                <w:sz w:val="19"/>
-              </w:rPr>
-              <w:t>Impacto / Riesgo</w:t>
-            </w:r>
-          </w:p>
-        </w:tc>
-        <w:tc>
-          <w:tcPr>
-            <w:tcW w:type="dxa" w:w="2880"/>
-            <w:shd w:fill="0A2540"/>
-            <w:tcMar>
-              <w:top w:w="120" w:type="dxa"/>
-              <w:bottom w:w="120" w:type="dxa"/>
-              <w:left w:w="140" w:type="dxa"/>
-              <w:right w:w="140" w:type="dxa"/>
-            </w:tcMar>
-          </w:tcPr>
-          <w:p>
-            <w:pPr>
-              <w:jc w:val="center"/>
-            </w:pPr>
-            <w:r>
-              <w:rPr>
-                <w:rFonts w:ascii="Arial" w:hAnsi="Arial"/>
-                <w:b/>
-                <w:color w:val="FFFFFF"/>
-                <w:sz w:val="19"/>
-              </w:rPr>
-              <w:t>Decisión y Solución Técnica</w:t>
-            </w:r>
-          </w:p>
-        </w:tc>
-      </w:tr>
-      <w:tr>
-        <w:tc>
-          <w:tcPr>
-            <w:tcW w:type="dxa" w:w="720"/>
-            <w:shd w:fill="FFFFFF"/>
-            <w:tcMar>
-              <w:top w:w="80" w:type="dxa"/>
-              <w:bottom w:w="80" w:type="dxa"/>
-              <w:left w:w="120" w:type="dxa"/>
-              <w:right w:w="120" w:type="dxa"/>
-            </w:tcMar>
-          </w:tcPr>
-          <w:p>
-            <w:pPr>
-              <w:jc w:val="left"/>
-            </w:pPr>
-            <w:r>
-              <w:rPr>
-                <w:rFonts w:ascii="Arial" w:hAnsi="Arial"/>
-                <w:color w:val="282828"/>
-                <w:sz w:val="18"/>
-              </w:rPr>
-              <w:t>1</w:t>
-            </w:r>
-          </w:p>
-        </w:tc>
-        <w:tc>
-          <w:tcPr>
-            <w:tcW w:type="dxa" w:w="3168"/>
-            <w:shd w:fill="FFFFFF"/>
-            <w:tcMar>
-              <w:top w:w="80" w:type="dxa"/>
-              <w:bottom w:w="80" w:type="dxa"/>
-              <w:left w:w="120" w:type="dxa"/>
-              <w:right w:w="120" w:type="dxa"/>
-            </w:tcMar>
-          </w:tcPr>
-          <w:p>
-            <w:r>
-              <w:rPr>
-                <w:rFonts w:ascii="Arial" w:hAnsi="Arial"/>
-                <w:color w:val="282828"/>
-                <w:sz w:val="18"/>
-              </w:rPr>
-              <w:t>PO quiere activar el toggle al 20% este viernes por presión de marketing.</w:t>
-            </w:r>
-          </w:p>
-        </w:tc>
-        <w:tc>
-          <w:tcPr>
-            <w:tcW w:type="dxa" w:w="2592"/>
-            <w:shd w:fill="FFFFFF"/>
-            <w:tcMar>
-              <w:top w:w="80" w:type="dxa"/>
-              <w:bottom w:w="80" w:type="dxa"/>
-              <w:left w:w="120" w:type="dxa"/>
-              <w:right w:w="120" w:type="dxa"/>
-            </w:tcMar>
-          </w:tcPr>
-          <w:p>
-            <w:r>
-              <w:rPr>
-                <w:rFonts w:ascii="Arial" w:hAnsi="Arial"/>
-                <w:color w:val="282828"/>
-                <w:sz w:val="18"/>
-              </w:rPr>
-              <w:t>Riesgo alto de caída sin validación previa.</w:t>
-            </w:r>
-          </w:p>
-        </w:tc>
-        <w:tc>
-          <w:tcPr>
-            <w:tcW w:type="dxa" w:w="2880"/>
-            <w:shd w:fill="FFFFFF"/>
-            <w:tcMar>
-              <w:top w:w="80" w:type="dxa"/>
-              <w:bottom w:w="80" w:type="dxa"/>
-              <w:left w:w="120" w:type="dxa"/>
-              <w:right w:w="120" w:type="dxa"/>
-            </w:tcMar>
-          </w:tcPr>
-          <w:p>
-            <w:r>
-              <w:rPr>
-                <w:rFonts w:ascii="Arial" w:hAnsi="Arial"/>
-                <w:color w:val="282828"/>
-                <w:sz w:val="18"/>
-              </w:rPr>
-              <w:t>Rollout Canario en 4 etapas: Interno -&gt; 5% -&gt; 20% comercial.</w:t>
-            </w:r>
-          </w:p>
-        </w:tc>
-      </w:tr>
-      <w:tr>
-        <w:tc>
-          <w:tcPr>
-            <w:tcW w:type="dxa" w:w="720"/>
-            <w:shd w:fill="F8FAFC"/>
-            <w:tcMar>
-              <w:top w:w="80" w:type="dxa"/>
-              <w:bottom w:w="80" w:type="dxa"/>
-              <w:left w:w="120" w:type="dxa"/>
-              <w:right w:w="120" w:type="dxa"/>
-            </w:tcMar>
-          </w:tcPr>
-          <w:p>
-            <w:pPr>
-              <w:jc w:val="left"/>
-            </w:pPr>
-            <w:r>
-              <w:rPr>
-                <w:rFonts w:ascii="Arial" w:hAnsi="Arial"/>
-                <w:color w:val="282828"/>
-                <w:sz w:val="18"/>
-              </w:rPr>
-              <w:t>2</w:t>
-            </w:r>
-          </w:p>
-        </w:tc>
-        <w:tc>
-          <w:tcPr>
-            <w:tcW w:type="dxa" w:w="3168"/>
-            <w:shd w:fill="F8FAFC"/>
-            <w:tcMar>
-              <w:top w:w="80" w:type="dxa"/>
-              <w:bottom w:w="80" w:type="dxa"/>
-              <w:left w:w="120" w:type="dxa"/>
-              <w:right w:w="120" w:type="dxa"/>
-            </w:tcMar>
-          </w:tcPr>
-          <w:p>
-            <w:r>
-              <w:rPr>
-                <w:rFonts w:ascii="Arial" w:hAnsi="Arial"/>
-                <w:color w:val="282828"/>
-                <w:sz w:val="18"/>
-              </w:rPr>
-              <w:t>Último deploy automático falló health check 11 minutos; rollback manual.</w:t>
-            </w:r>
-          </w:p>
-        </w:tc>
-        <w:tc>
-          <w:tcPr>
-            <w:tcW w:type="dxa" w:w="2592"/>
-            <w:shd w:fill="F8FAFC"/>
-            <w:tcMar>
-              <w:top w:w="80" w:type="dxa"/>
-              <w:bottom w:w="80" w:type="dxa"/>
-              <w:left w:w="120" w:type="dxa"/>
-              <w:right w:w="120" w:type="dxa"/>
-            </w:tcMar>
-          </w:tcPr>
-          <w:p>
-            <w:r>
-              <w:rPr>
-                <w:rFonts w:ascii="Arial" w:hAnsi="Arial"/>
-                <w:color w:val="282828"/>
-                <w:sz w:val="18"/>
-              </w:rPr>
-              <w:t>Falta de resiliencia y downtime en Render.</w:t>
-            </w:r>
-          </w:p>
-        </w:tc>
-        <w:tc>
-          <w:tcPr>
-            <w:tcW w:type="dxa" w:w="2880"/>
-            <w:shd w:fill="F8FAFC"/>
-            <w:tcMar>
-              <w:top w:w="80" w:type="dxa"/>
-              <w:bottom w:w="80" w:type="dxa"/>
-              <w:left w:w="120" w:type="dxa"/>
-              <w:right w:w="120" w:type="dxa"/>
-            </w:tcMar>
-          </w:tcPr>
-          <w:p>
-            <w:r>
-              <w:rPr>
-                <w:rFonts w:ascii="Arial" w:hAnsi="Arial"/>
-                <w:color w:val="282828"/>
-                <w:sz w:val="18"/>
-              </w:rPr>
-              <w:t>Reingeniería de /health con Liveness/Readiness no bloqueantes (&lt;10ms).</w:t>
-            </w:r>
-          </w:p>
-        </w:tc>
-      </w:tr>
-      <w:tr>
-        <w:tc>
-          <w:tcPr>
-            <w:tcW w:type="dxa" w:w="720"/>
-            <w:shd w:fill="FFFFFF"/>
-            <w:tcMar>
-              <w:top w:w="80" w:type="dxa"/>
-              <w:bottom w:w="80" w:type="dxa"/>
-              <w:left w:w="120" w:type="dxa"/>
-              <w:right w:w="120" w:type="dxa"/>
-            </w:tcMar>
-          </w:tcPr>
-          <w:p>
-            <w:pPr>
-              <w:jc w:val="left"/>
-            </w:pPr>
-            <w:r>
-              <w:rPr>
-                <w:rFonts w:ascii="Arial" w:hAnsi="Arial"/>
-                <w:color w:val="282828"/>
-                <w:sz w:val="18"/>
-              </w:rPr>
-              <w:t>3</w:t>
-            </w:r>
-          </w:p>
-        </w:tc>
-        <w:tc>
-          <w:tcPr>
-            <w:tcW w:type="dxa" w:w="3168"/>
-            <w:shd w:fill="FFFFFF"/>
-            <w:tcMar>
-              <w:top w:w="80" w:type="dxa"/>
-              <w:bottom w:w="80" w:type="dxa"/>
-              <w:left w:w="120" w:type="dxa"/>
-              <w:right w:w="120" w:type="dxa"/>
-            </w:tcMar>
-          </w:tcPr>
-          <w:p>
-            <w:r>
-              <w:rPr>
-                <w:rFonts w:ascii="Arial" w:hAnsi="Arial"/>
-                <w:color w:val="282828"/>
-                <w:sz w:val="18"/>
-              </w:rPr>
-              <w:t>3 Feature Toggles llevan &gt; 45 días activos y nadie los ha limpiado.</w:t>
-            </w:r>
-          </w:p>
-        </w:tc>
-        <w:tc>
-          <w:tcPr>
-            <w:tcW w:type="dxa" w:w="2592"/>
-            <w:shd w:fill="FFFFFF"/>
-            <w:tcMar>
-              <w:top w:w="80" w:type="dxa"/>
-              <w:bottom w:w="80" w:type="dxa"/>
-              <w:left w:w="120" w:type="dxa"/>
-              <w:right w:w="120" w:type="dxa"/>
-            </w:tcMar>
-          </w:tcPr>
-          <w:p>
-            <w:r>
-              <w:rPr>
-                <w:rFonts w:ascii="Arial" w:hAnsi="Arial"/>
-                <w:color w:val="282828"/>
-                <w:sz w:val="18"/>
-              </w:rPr>
-              <w:t>Deuda técnica y código muerto acumulado.</w:t>
-            </w:r>
-          </w:p>
-        </w:tc>
-        <w:tc>
-          <w:tcPr>
-            <w:tcW w:type="dxa" w:w="2880"/>
-            <w:shd w:fill="FFFFFF"/>
-            <w:tcMar>
-              <w:top w:w="80" w:type="dxa"/>
-              <w:bottom w:w="80" w:type="dxa"/>
-              <w:left w:w="120" w:type="dxa"/>
-              <w:right w:w="120" w:type="dxa"/>
-            </w:tcMar>
-          </w:tcPr>
-          <w:p>
-            <w:r>
-              <w:rPr>
-                <w:rFonts w:ascii="Arial" w:hAnsi="Arial"/>
-                <w:color w:val="282828"/>
-                <w:sz w:val="18"/>
-              </w:rPr>
-              <w:t>Política v3.0: caducidad a 30 días y ejecución de cleanup.</w:t>
-            </w:r>
-          </w:p>
-        </w:tc>
-      </w:tr>
-      <w:tr>
-        <w:tc>
-          <w:tcPr>
-            <w:tcW w:type="dxa" w:w="720"/>
-            <w:shd w:fill="F8FAFC"/>
-            <w:tcMar>
-              <w:top w:w="80" w:type="dxa"/>
-              <w:bottom w:w="80" w:type="dxa"/>
-              <w:left w:w="120" w:type="dxa"/>
-              <w:right w:w="120" w:type="dxa"/>
-            </w:tcMar>
-          </w:tcPr>
-          <w:p>
-            <w:pPr>
-              <w:jc w:val="left"/>
-            </w:pPr>
-            <w:r>
-              <w:rPr>
-                <w:rFonts w:ascii="Arial" w:hAnsi="Arial"/>
-                <w:color w:val="282828"/>
-                <w:sz w:val="18"/>
-              </w:rPr>
-              <w:t>4</w:t>
-            </w:r>
-          </w:p>
-        </w:tc>
-        <w:tc>
-          <w:tcPr>
-            <w:tcW w:type="dxa" w:w="3168"/>
-            <w:shd w:fill="F8FAFC"/>
-            <w:tcMar>
-              <w:top w:w="80" w:type="dxa"/>
-              <w:bottom w:w="80" w:type="dxa"/>
-              <w:left w:w="120" w:type="dxa"/>
-              <w:right w:w="120" w:type="dxa"/>
-            </w:tcMar>
-          </w:tcPr>
-          <w:p>
-            <w:r>
-              <w:rPr>
-                <w:rFonts w:ascii="Arial" w:hAnsi="Arial"/>
-                <w:color w:val="282828"/>
-                <w:sz w:val="18"/>
-              </w:rPr>
-              <w:t>Solo 4 integraciones a main en el sprint (lejos de la meta diaria).</w:t>
-            </w:r>
-          </w:p>
-        </w:tc>
-        <w:tc>
-          <w:tcPr>
-            <w:tcW w:type="dxa" w:w="2592"/>
-            <w:shd w:fill="F8FAFC"/>
-            <w:tcMar>
-              <w:top w:w="80" w:type="dxa"/>
-              <w:bottom w:w="80" w:type="dxa"/>
-              <w:left w:w="120" w:type="dxa"/>
-              <w:right w:w="120" w:type="dxa"/>
-            </w:tcMar>
-          </w:tcPr>
-          <w:p>
-            <w:r>
-              <w:rPr>
-                <w:rFonts w:ascii="Arial" w:hAnsi="Arial"/>
-                <w:color w:val="282828"/>
-                <w:sz w:val="18"/>
-              </w:rPr>
-              <w:t>Pérdida de cadencia TBD y acumulación de ramas.</w:t>
-            </w:r>
-          </w:p>
-        </w:tc>
-        <w:tc>
-          <w:tcPr>
-            <w:tcW w:type="dxa" w:w="2880"/>
-            <w:shd w:fill="F8FAFC"/>
-            <w:tcMar>
-              <w:top w:w="80" w:type="dxa"/>
-              <w:bottom w:w="80" w:type="dxa"/>
-              <w:left w:w="120" w:type="dxa"/>
-              <w:right w:w="120" w:type="dxa"/>
-            </w:tcMar>
-          </w:tcPr>
-          <w:p>
-            <w:r>
-              <w:rPr>
-                <w:rFonts w:ascii="Arial" w:hAnsi="Arial"/>
-                <w:color w:val="282828"/>
-                <w:sz w:val="18"/>
-              </w:rPr>
-              <w:t>Vertical slicing fino (&lt;200 líneas) y protección con toggles.</w:t>
-            </w:r>
-          </w:p>
-        </w:tc>
-      </w:tr>
-      <w:tr>
-        <w:tc>
-          <w:tcPr>
-            <w:tcW w:type="dxa" w:w="720"/>
-            <w:shd w:fill="FFFFFF"/>
-            <w:tcMar>
-              <w:top w:w="80" w:type="dxa"/>
-              <w:bottom w:w="80" w:type="dxa"/>
-              <w:left w:w="120" w:type="dxa"/>
-              <w:right w:w="120" w:type="dxa"/>
-            </w:tcMar>
-          </w:tcPr>
-          <w:p>
-            <w:pPr>
-              <w:jc w:val="left"/>
-            </w:pPr>
-            <w:r>
-              <w:rPr>
-                <w:rFonts w:ascii="Arial" w:hAnsi="Arial"/>
-                <w:color w:val="282828"/>
-                <w:sz w:val="18"/>
-              </w:rPr>
-              <w:t>5</w:t>
-            </w:r>
-          </w:p>
-        </w:tc>
-        <w:tc>
-          <w:tcPr>
-            <w:tcW w:type="dxa" w:w="3168"/>
-            <w:shd w:fill="FFFFFF"/>
-            <w:tcMar>
-              <w:top w:w="80" w:type="dxa"/>
-              <w:bottom w:w="80" w:type="dxa"/>
-              <w:left w:w="120" w:type="dxa"/>
-              <w:right w:w="120" w:type="dxa"/>
-            </w:tcMar>
-          </w:tcPr>
-          <w:p>
-            <w:r>
-              <w:rPr>
-                <w:rFonts w:ascii="Arial" w:hAnsi="Arial"/>
-                <w:color w:val="282828"/>
-                <w:sz w:val="18"/>
-              </w:rPr>
-              <w:t>Rama viva 4 días por test flaky que ponía el CI en rojo.</w:t>
-            </w:r>
-          </w:p>
-        </w:tc>
-        <w:tc>
-          <w:tcPr>
-            <w:tcW w:type="dxa" w:w="2592"/>
-            <w:shd w:fill="FFFFFF"/>
-            <w:tcMar>
-              <w:top w:w="80" w:type="dxa"/>
-              <w:bottom w:w="80" w:type="dxa"/>
-              <w:left w:w="120" w:type="dxa"/>
-              <w:right w:w="120" w:type="dxa"/>
-            </w:tcMar>
-          </w:tcPr>
-          <w:p>
-            <w:r>
-              <w:rPr>
-                <w:rFonts w:ascii="Arial" w:hAnsi="Arial"/>
-                <w:color w:val="282828"/>
-                <w:sz w:val="18"/>
-              </w:rPr>
-              <w:t>Miedo del equipo a integrar y retraso en entrega.</w:t>
-            </w:r>
-          </w:p>
-        </w:tc>
-        <w:tc>
-          <w:tcPr>
-            <w:tcW w:type="dxa" w:w="2880"/>
-            <w:shd w:fill="FFFFFF"/>
-            <w:tcMar>
-              <w:top w:w="80" w:type="dxa"/>
-              <w:bottom w:w="80" w:type="dxa"/>
-              <w:left w:w="120" w:type="dxa"/>
-              <w:right w:w="120" w:type="dxa"/>
-            </w:tcMar>
-          </w:tcPr>
-          <w:p>
-            <w:r>
-              <w:rPr>
-                <w:rFonts w:ascii="Arial" w:hAnsi="Arial"/>
-                <w:color w:val="282828"/>
-                <w:sz w:val="18"/>
-              </w:rPr>
-              <w:t>Protocolo de cuarentena inmediata y test determinista con mocks.</w:t>
-            </w:r>
-          </w:p>
-        </w:tc>
-      </w:tr>
-      <w:tr>
-        <w:tc>
-          <w:tcPr>
-            <w:tcW w:type="dxa" w:w="720"/>
-            <w:shd w:fill="F8FAFC"/>
-            <w:tcMar>
-              <w:top w:w="80" w:type="dxa"/>
-              <w:bottom w:w="80" w:type="dxa"/>
-              <w:left w:w="120" w:type="dxa"/>
-              <w:right w:w="120" w:type="dxa"/>
-            </w:tcMar>
-          </w:tcPr>
-          <w:p>
-            <w:pPr>
-              <w:jc w:val="left"/>
-            </w:pPr>
-            <w:r>
-              <w:rPr>
-                <w:rFonts w:ascii="Arial" w:hAnsi="Arial"/>
-                <w:color w:val="282828"/>
-                <w:sz w:val="18"/>
-              </w:rPr>
-              <w:t>6</w:t>
-            </w:r>
-          </w:p>
-        </w:tc>
-        <w:tc>
-          <w:tcPr>
-            <w:tcW w:type="dxa" w:w="3168"/>
-            <w:shd w:fill="F8FAFC"/>
-            <w:tcMar>
-              <w:top w:w="80" w:type="dxa"/>
-              <w:bottom w:w="80" w:type="dxa"/>
-              <w:left w:w="120" w:type="dxa"/>
-              <w:right w:w="120" w:type="dxa"/>
-            </w:tcMar>
-          </w:tcPr>
-          <w:p>
-            <w:r>
-              <w:rPr>
-                <w:rFonts w:ascii="Arial" w:hAnsi="Arial"/>
-                <w:color w:val="282828"/>
-                <w:sz w:val="18"/>
-              </w:rPr>
-              <w:t>No existe métrica de conversión o error para observar el toggle.</w:t>
-            </w:r>
-          </w:p>
-        </w:tc>
-        <w:tc>
-          <w:tcPr>
-            <w:tcW w:type="dxa" w:w="2592"/>
-            <w:shd w:fill="F8FAFC"/>
-            <w:tcMar>
-              <w:top w:w="80" w:type="dxa"/>
-              <w:bottom w:w="80" w:type="dxa"/>
-              <w:left w:w="120" w:type="dxa"/>
-              <w:right w:w="120" w:type="dxa"/>
-            </w:tcMar>
-          </w:tcPr>
-          <w:p>
-            <w:r>
-              <w:rPr>
-                <w:rFonts w:ascii="Arial" w:hAnsi="Arial"/>
-                <w:color w:val="282828"/>
-                <w:sz w:val="18"/>
-              </w:rPr>
-              <w:t>Ceguera operativa al encender la funcionalidad.</w:t>
-            </w:r>
-          </w:p>
-        </w:tc>
-        <w:tc>
-          <w:tcPr>
-            <w:tcW w:type="dxa" w:w="2880"/>
-            <w:shd w:fill="F8FAFC"/>
-            <w:tcMar>
-              <w:top w:w="80" w:type="dxa"/>
-              <w:bottom w:w="80" w:type="dxa"/>
-              <w:left w:w="120" w:type="dxa"/>
-              <w:right w:w="120" w:type="dxa"/>
-            </w:tcMar>
-          </w:tcPr>
-          <w:p>
-            <w:r>
-              <w:rPr>
-                <w:rFonts w:ascii="Arial" w:hAnsi="Arial"/>
-                <w:color w:val="282828"/>
-                <w:sz w:val="18"/>
-              </w:rPr>
-              <w:t>Módulo de telemetría (/api/v1/metrics) con Golden Signals.</w:t>
-            </w:r>
-          </w:p>
-        </w:tc>
-      </w:tr>
-      <w:tr>
-        <w:tc>
-          <w:tcPr>
-            <w:tcW w:type="dxa" w:w="720"/>
-            <w:shd w:fill="FFFFFF"/>
-            <w:tcMar>
-              <w:top w:w="80" w:type="dxa"/>
-              <w:bottom w:w="80" w:type="dxa"/>
-              <w:left w:w="120" w:type="dxa"/>
-              <w:right w:w="120" w:type="dxa"/>
-            </w:tcMar>
-          </w:tcPr>
-          <w:p>
-            <w:pPr>
-              <w:jc w:val="left"/>
-            </w:pPr>
-            <w:r>
-              <w:rPr>
-                <w:rFonts w:ascii="Arial" w:hAnsi="Arial"/>
-                <w:color w:val="282828"/>
-                <w:sz w:val="18"/>
-              </w:rPr>
-              <w:t>7</w:t>
-            </w:r>
-          </w:p>
-        </w:tc>
-        <w:tc>
-          <w:tcPr>
-            <w:tcW w:type="dxa" w:w="3168"/>
-            <w:shd w:fill="FFFFFF"/>
-            <w:tcMar>
-              <w:top w:w="80" w:type="dxa"/>
-              <w:bottom w:w="80" w:type="dxa"/>
-              <w:left w:w="120" w:type="dxa"/>
-              <w:right w:w="120" w:type="dxa"/>
-            </w:tcMar>
-          </w:tcPr>
-          <w:p>
-            <w:r>
-              <w:rPr>
-                <w:rFonts w:ascii="Arial" w:hAnsi="Arial"/>
-                <w:color w:val="282828"/>
-                <w:sz w:val="18"/>
-              </w:rPr>
-              <w:t>Stakeholder anunció que 'Pagos Express ya está listo'.</w:t>
-            </w:r>
-          </w:p>
-        </w:tc>
-        <w:tc>
-          <w:tcPr>
-            <w:tcW w:type="dxa" w:w="2592"/>
-            <w:shd w:fill="FFFFFF"/>
-            <w:tcMar>
-              <w:top w:w="80" w:type="dxa"/>
-              <w:bottom w:w="80" w:type="dxa"/>
-              <w:left w:w="120" w:type="dxa"/>
-              <w:right w:w="120" w:type="dxa"/>
-            </w:tcMar>
-          </w:tcPr>
-          <w:p>
-            <w:r>
-              <w:rPr>
-                <w:rFonts w:ascii="Arial" w:hAnsi="Arial"/>
-                <w:color w:val="282828"/>
-                <w:sz w:val="18"/>
-              </w:rPr>
-              <w:t>Confusión entre deploy técnico y release comercial.</w:t>
-            </w:r>
-          </w:p>
-        </w:tc>
-        <w:tc>
-          <w:tcPr>
-            <w:tcW w:type="dxa" w:w="2880"/>
-            <w:shd w:fill="FFFFFF"/>
-            <w:tcMar>
-              <w:top w:w="80" w:type="dxa"/>
-              <w:bottom w:w="80" w:type="dxa"/>
-              <w:left w:w="120" w:type="dxa"/>
-              <w:right w:w="120" w:type="dxa"/>
-            </w:tcMar>
-          </w:tcPr>
-          <w:p>
-            <w:r>
-              <w:rPr>
-                <w:rFonts w:ascii="Arial" w:hAnsi="Arial"/>
-                <w:color w:val="282828"/>
-                <w:sz w:val="18"/>
-              </w:rPr>
-              <w:t>Alineación en Playbook: Despliegue ≠ Lanzamiento comercial.</w:t>
-            </w:r>
-          </w:p>
-        </w:tc>
-      </w:tr>
-    </w:tbl>
-    <w:p>
-      <w:pPr>
-        <w:spacing w:after="200"/>
-      </w:pPr>
-    </w:p>
-    <w:p>
-      <w:pPr>
-        <w:pStyle w:val="Heading1"/>
-      </w:pPr>
-      <w:r>
-        <w:t>3. Adaptación del Sprint Review al Continuous Deployment</w:t>
-      </w:r>
-    </w:p>
-    <w:p>
-      <w:pPr>
-        <w:pStyle w:val="Heading2"/>
-      </w:pPr>
-      <w:r>
-        <w:t>3.1 Principios del Nuevo Review</w:t>
-      </w:r>
-    </w:p>
-    <w:tbl>
-      <w:tblPr>
-        <w:tblW w:type="auto" w:w="0"/>
-        <w:jc w:val="center"/>
-        <w:tblLook w:firstColumn="1" w:firstRow="1" w:lastColumn="0" w:lastRow="0" w:noHBand="0" w:noVBand="1" w:val="04A0"/>
-      </w:tblPr>
-      <w:tblGrid>
-        <w:gridCol w:w="3120"/>
-        <w:gridCol w:w="3120"/>
-        <w:gridCol w:w="3120"/>
-      </w:tblGrid>
-      <w:tr>
-        <w:tc>
-          <w:tcPr>
-            <w:tcW w:type="dxa" w:w="2880"/>
-            <w:shd w:fill="0A2540"/>
-            <w:tcMar>
-              <w:top w:w="120" w:type="dxa"/>
-              <w:bottom w:w="120" w:type="dxa"/>
-              <w:left w:w="140" w:type="dxa"/>
-              <w:right w:w="140" w:type="dxa"/>
-            </w:tcMar>
-          </w:tcPr>
-          <w:p>
-            <w:pPr>
-              <w:jc w:val="center"/>
-            </w:pPr>
-            <w:r>
-              <w:rPr>
-                <w:rFonts w:ascii="Arial" w:hAnsi="Arial"/>
-                <w:b/>
-                <w:color w:val="FFFFFF"/>
-                <w:sz w:val="19"/>
-              </w:rPr>
-              <w:t>Dimensión</w:t>
+              <w:t>🟡 Lo que generó fricción</w:t>
             </w:r>
           </w:p>
         </w:tc>
@@ -1045,33 +304,7 @@
                 <w:color w:val="FFFFFF"/>
                 <w:sz w:val="19"/>
               </w:rPr>
-              <w:t>Review Clásico (Scrum Antiguo)</w:t>
-            </w:r>
-          </w:p>
-        </w:tc>
-        <w:tc>
-          <w:tcPr>
-            <w:tcW w:type="dxa" w:w="3312"/>
-            <w:shd w:fill="0A2540"/>
-            <w:tcMar>
-              <w:top w:w="120" w:type="dxa"/>
-              <w:bottom w:w="120" w:type="dxa"/>
-              <w:left w:w="140" w:type="dxa"/>
-              <w:right w:w="140" w:type="dxa"/>
-            </w:tcMar>
-          </w:tcPr>
-          <w:p>
-            <w:pPr>
-              <w:jc w:val="center"/>
-            </w:pPr>
-            <w:r>
-              <w:rPr>
-                <w:rFonts w:ascii="Arial" w:hAnsi="Arial"/>
-                <w:b/>
-                <w:color w:val="FFFFFF"/>
-                <w:sz w:val="19"/>
-              </w:rPr>
-              <w:t>Review en CD + TBD (Flujo Moderno)</w:t>
+              <w:t>🔴 Lo que rompió el flujo / miedo</w:t>
             </w:r>
           </w:p>
         </w:tc>
@@ -1079,7 +312,7 @@
       <w:tr>
         <w:tc>
           <w:tcPr>
-            <w:tcW w:type="dxa" w:w="2880"/>
+            <w:tcW w:type="dxa" w:w="3024"/>
             <w:shd w:fill="FFFFFF"/>
             <w:tcMar>
               <w:top w:w="80" w:type="dxa"/>
@@ -1089,16 +322,15 @@
             </w:tcMar>
           </w:tcPr>
           <w:p>
-            <w:pPr>
-              <w:jc w:val="left"/>
-            </w:pPr>
             <w:r>
               <w:rPr>
                 <w:rFonts w:ascii="Arial" w:hAnsi="Arial"/>
                 <w:color w:val="282828"/>
                 <w:sz w:val="18"/>
               </w:rPr>
-              <w:t>Entorno de Demostración</w:t>
+              <w:t>• Despliegue automático a Render cumpliendo DoD técnico.</w:t>
+              <w:br/>
+              <w:t>• Aislamiento efectivo de código sin riesgo al usuario final mediante pagos-express-v1 en ConfigCat.</w:t>
             </w:r>
           </w:p>
         </w:tc>
@@ -1120,127 +352,11 @@
                 <w:color w:val="282828"/>
                 <w:sz w:val="18"/>
               </w:rPr>
-              <w:t>Local o Staging aislado y desactualizado.</w:t>
-            </w:r>
-          </w:p>
-        </w:tc>
-        <w:tc>
-          <w:tcPr>
-            <w:tcW w:type="dxa" w:w="3312"/>
-            <w:shd w:fill="FFFFFF"/>
-            <w:tcMar>
-              <w:top w:w="80" w:type="dxa"/>
-              <w:bottom w:w="80" w:type="dxa"/>
-              <w:left w:w="120" w:type="dxa"/>
-              <w:right w:w="120" w:type="dxa"/>
-            </w:tcMar>
-          </w:tcPr>
-          <w:p>
-            <w:r>
-              <w:rPr>
-                <w:rFonts w:ascii="Arial" w:hAnsi="Arial"/>
-                <w:color w:val="282828"/>
-                <w:sz w:val="18"/>
-              </w:rPr>
-              <w:t>Producción real en Render con datos vivos.</w:t>
-            </w:r>
-          </w:p>
-        </w:tc>
-      </w:tr>
-      <w:tr>
-        <w:tc>
-          <w:tcPr>
-            <w:tcW w:type="dxa" w:w="2880"/>
-            <w:shd w:fill="F8FAFC"/>
-            <w:tcMar>
-              <w:top w:w="80" w:type="dxa"/>
-              <w:bottom w:w="80" w:type="dxa"/>
-              <w:left w:w="120" w:type="dxa"/>
-              <w:right w:w="120" w:type="dxa"/>
-            </w:tcMar>
-          </w:tcPr>
-          <w:p>
-            <w:pPr>
-              <w:jc w:val="left"/>
-            </w:pPr>
-            <w:r>
-              <w:rPr>
-                <w:rFonts w:ascii="Arial" w:hAnsi="Arial"/>
-                <w:color w:val="282828"/>
-                <w:sz w:val="18"/>
-              </w:rPr>
-              <w:t>Naturaleza de Entrega</w:t>
-            </w:r>
-          </w:p>
-        </w:tc>
-        <w:tc>
-          <w:tcPr>
-            <w:tcW w:type="dxa" w:w="3168"/>
-            <w:shd w:fill="F8FAFC"/>
-            <w:tcMar>
-              <w:top w:w="80" w:type="dxa"/>
-              <w:bottom w:w="80" w:type="dxa"/>
-              <w:left w:w="120" w:type="dxa"/>
-              <w:right w:w="120" w:type="dxa"/>
-            </w:tcMar>
-          </w:tcPr>
-          <w:p>
-            <w:r>
-              <w:rPr>
-                <w:rFonts w:ascii="Arial" w:hAnsi="Arial"/>
-                <w:color w:val="282828"/>
-                <w:sz w:val="18"/>
-              </w:rPr>
-              <w:t>Todo o nada (incremento monolítico).</w:t>
-            </w:r>
-          </w:p>
-        </w:tc>
-        <w:tc>
-          <w:tcPr>
-            <w:tcW w:type="dxa" w:w="3312"/>
-            <w:shd w:fill="F8FAFC"/>
-            <w:tcMar>
-              <w:top w:w="80" w:type="dxa"/>
-              <w:bottom w:w="80" w:type="dxa"/>
-              <w:left w:w="120" w:type="dxa"/>
-              <w:right w:w="120" w:type="dxa"/>
-            </w:tcMar>
-          </w:tcPr>
-          <w:p>
-            <w:r>
-              <w:rPr>
-                <w:rFonts w:ascii="Arial" w:hAnsi="Arial"/>
-                <w:color w:val="282828"/>
-                <w:sz w:val="18"/>
-              </w:rPr>
-              <w:t>Valor incremental gobernado por Feature Flags.</w:t>
-            </w:r>
-          </w:p>
-        </w:tc>
-      </w:tr>
-      <w:tr>
-        <w:tc>
-          <w:tcPr>
-            <w:tcW w:type="dxa" w:w="2880"/>
-            <w:shd w:fill="FFFFFF"/>
-            <w:tcMar>
-              <w:top w:w="80" w:type="dxa"/>
-              <w:bottom w:w="80" w:type="dxa"/>
-              <w:left w:w="120" w:type="dxa"/>
-              <w:right w:w="120" w:type="dxa"/>
-            </w:tcMar>
-          </w:tcPr>
-          <w:p>
-            <w:pPr>
-              <w:jc w:val="left"/>
-            </w:pPr>
-            <w:r>
-              <w:rPr>
-                <w:rFonts w:ascii="Arial" w:hAnsi="Arial"/>
-                <w:color w:val="282828"/>
-                <w:sz w:val="18"/>
-              </w:rPr>
-              <w:t>Frecuencia de Feedback</w:t>
+              <w:t>• Tests flaky en CI que demoraron integraciones.</w:t>
+              <w:br/>
+              <w:t>• Presión comercial del PO por activar en viernes sin observabilidad.</w:t>
+              <w:br/>
+              <w:t>• Solo 4 integraciones en el sprint.</w:t>
             </w:r>
           </w:p>
         </w:tc>
@@ -1262,100 +378,11 @@
                 <w:color w:val="282828"/>
                 <w:sz w:val="18"/>
               </w:rPr>
-              <w:t>Diferido cada 2-3 semanas.</w:t>
-            </w:r>
-          </w:p>
-        </w:tc>
-        <w:tc>
-          <w:tcPr>
-            <w:tcW w:type="dxa" w:w="3312"/>
-            <w:shd w:fill="FFFFFF"/>
-            <w:tcMar>
-              <w:top w:w="80" w:type="dxa"/>
-              <w:bottom w:w="80" w:type="dxa"/>
-              <w:left w:w="120" w:type="dxa"/>
-              <w:right w:w="120" w:type="dxa"/>
-            </w:tcMar>
-          </w:tcPr>
-          <w:p>
-            <w:r>
-              <w:rPr>
-                <w:rFonts w:ascii="Arial" w:hAnsi="Arial"/>
-                <w:color w:val="282828"/>
-                <w:sz w:val="18"/>
-              </w:rPr>
-              <w:t>Continuo, inmediato y basado en telemetría.</w:t>
-            </w:r>
-          </w:p>
-        </w:tc>
-      </w:tr>
-      <w:tr>
-        <w:tc>
-          <w:tcPr>
-            <w:tcW w:type="dxa" w:w="2880"/>
-            <w:shd w:fill="F8FAFC"/>
-            <w:tcMar>
-              <w:top w:w="80" w:type="dxa"/>
-              <w:bottom w:w="80" w:type="dxa"/>
-              <w:left w:w="120" w:type="dxa"/>
-              <w:right w:w="120" w:type="dxa"/>
-            </w:tcMar>
-          </w:tcPr>
-          <w:p>
-            <w:pPr>
-              <w:jc w:val="left"/>
-            </w:pPr>
-            <w:r>
-              <w:rPr>
-                <w:rFonts w:ascii="Arial" w:hAnsi="Arial"/>
-                <w:color w:val="282828"/>
-                <w:sz w:val="18"/>
-              </w:rPr>
-              <w:t>Foco de la Reunión</w:t>
-            </w:r>
-          </w:p>
-        </w:tc>
-        <w:tc>
-          <w:tcPr>
-            <w:tcW w:type="dxa" w:w="3168"/>
-            <w:shd w:fill="F8FAFC"/>
-            <w:tcMar>
-              <w:top w:w="80" w:type="dxa"/>
-              <w:bottom w:w="80" w:type="dxa"/>
-              <w:left w:w="120" w:type="dxa"/>
-              <w:right w:w="120" w:type="dxa"/>
-            </w:tcMar>
-          </w:tcPr>
-          <w:p>
-            <w:r>
-              <w:rPr>
-                <w:rFonts w:ascii="Arial" w:hAnsi="Arial"/>
-                <w:color w:val="282828"/>
-                <w:sz w:val="18"/>
-              </w:rPr>
-              <w:t>¿Qué construimos? (Puntos quemados).</w:t>
-            </w:r>
-          </w:p>
-        </w:tc>
-        <w:tc>
-          <w:tcPr>
-            <w:tcW w:type="dxa" w:w="3312"/>
-            <w:shd w:fill="F8FAFC"/>
-            <w:tcMar>
-              <w:top w:w="80" w:type="dxa"/>
-              <w:bottom w:w="80" w:type="dxa"/>
-              <w:left w:w="120" w:type="dxa"/>
-              <w:right w:w="120" w:type="dxa"/>
-            </w:tcMar>
-          </w:tcPr>
-          <w:p>
-            <w:r>
-              <w:rPr>
-                <w:rFonts w:ascii="Arial" w:hAnsi="Arial"/>
-                <w:color w:val="282828"/>
-                <w:sz w:val="18"/>
-              </w:rPr>
-              <w:t>¿Qué valor recibieron los usuarios y qué dicen los datos?</w:t>
+              <w:t>• Caída de 11 minutos por health check fallido.</w:t>
+              <w:br/>
+              <w:t>• Rollback manual no automatizado.</w:t>
+              <w:br/>
+              <w:t>• Acumulación de 3 toggles obsoletos (+45 días).</w:t>
             </w:r>
           </w:p>
         </w:tc>
@@ -1371,66 +398,18 @@
         <w:pStyle w:val="Heading2"/>
       </w:pPr>
       <w:r>
-        <w:t>3.2 Simulación de Sprint Review: 3 Incrementos Reales</w:t>
-      </w:r>
-    </w:p>
-    <w:p>
-      <w:pPr>
-        <w:pStyle w:val="Heading3"/>
-      </w:pPr>
-      <w:r>
-        <w:t>Incremento 1: Módulo de Pagos Express con un Clic (Toggle)</w:t>
+        <w:t>3.4 Tres Acciones de Mejora Obligatorias</w:t>
       </w:r>
     </w:p>
     <w:p>
       <w:r>
-        <w:t>• Problema resuelto: Reduce la fricción de compra eliminando 3 pantallas de llenado de formularios.</w:t>
+        <w:t>1. Acción 1 (Estabilidad de Pipeline): Cuarentenar de inmediato el test flaky del CI y configurar auto-rollback en Render ante fallos de health check. (Responsable: Developers).</w:t>
         <w:br/>
-        <w:t>• Estado de activación: Protegido por el toggle 'pagos-express-v1' (ConfigCat).</w:t>
         <w:br/>
-        <w:t>• Demo en vivo en Render: Se demuestra la alternancia entre el flujo estándar de 3 pasos (Toggle OFF) y el flujo Express tokenizado con 1 solo clic (Toggle ON).</w:t>
+        <w:t>2. Acción 2 (Higiene de Toggles): Incorporar al Definition of Done (DoD) que todo toggle con más de 30 días en producción se priorice obligatoriamente como tarea de limpieza en el backlog. (Responsable: Equipo / PO).</w:t>
         <w:br/>
-        <w:t>• Métrica de valor: Latencia reducida de 450 ms a 42 ms. Tasa de éxito del 100%.</w:t>
         <w:br/>
-        <w:t>• Pregunta al PO: “¿Considera que este flujo cumple los criterios para habilitarse al 20% comercial?” -&gt; Aprobado bajo monitoreo.</w:t>
-      </w:r>
-    </w:p>
-    <w:p>
-      <w:pPr>
-        <w:pStyle w:val="Heading3"/>
-      </w:pPr>
-      <w:r>
-        <w:t>Incremento 2: Healthcheck Proactivo con Liveness &amp; Readiness Probes</w:t>
-      </w:r>
-    </w:p>
-    <w:p>
-      <w:r>
-        <w:t>• Problema resuelto: Soluciona el incidente de 11 minutos de inactividad durante el despliegue automático.</w:t>
-        <w:br/>
-        <w:t>• Estado de activación: Activo al 100% en producción.</w:t>
-        <w:br/>
-        <w:t>• Demo en vivo: Endpoint /health responde 200 OK en 4 ms sin dependencias bloqueantes.</w:t>
-        <w:br/>
-        <w:t>• Métrica de valor: Cero fallos de orquestación en los últimos 15 despliegues a Render.</w:t>
-      </w:r>
-    </w:p>
-    <w:p>
-      <w:pPr>
-        <w:pStyle w:val="Heading3"/>
-      </w:pPr>
-      <w:r>
-        <w:t>Incremento 3: Telemetría y Observabilidad de Pagos en Tiempo Real</w:t>
-      </w:r>
-    </w:p>
-    <w:p>
-      <w:r>
-        <w:t>• Problema resuelto: Elimina la ceguera operativa antes de encender funcionalidades comerciales.</w:t>
-        <w:br/>
-        <w:t>• Estado de activación: Activo al 100% en producción.</w:t>
-        <w:br/>
-        <w:t>• Demo en vivo: Endpoint /api/v1/metrics expone tasas de error, conversiones y tiempos de respuesta.</w:t>
-        <w:br/>
-        <w:t>• Métrica de valor: Permite activar el Kill-Switch automático si el error rate supera el 1.5%.</w:t>
+        <w:t>3. Acción 3 (DoR de Liberación): Definir como criterio en el Definition of Ready (DoR) que ninguna funcionalidad se active a usuarios externos sin dashboards activos de errores HTTP 5xx y latencia. (Responsable: PO + Devs).</w:t>
       </w:r>
     </w:p>
     <w:p>
@@ -1438,7 +417,7 @@
         <w:pStyle w:val="Heading1"/>
       </w:pPr>
       <w:r>
-        <w:t>4. Adaptación de la Sprint Retrospective</w:t>
+        <w:t>4. POLÍTICA DE LIBERACIÓN SEGURA DE VALOR</w:t>
       </w:r>
     </w:p>
     <w:p>
@@ -1446,16 +425,14 @@
         <w:pStyle w:val="Heading2"/>
       </w:pPr>
       <w:r>
-        <w:t>4.1 Nuevos Focos Obligatorios de la Retro</w:t>
+        <w:t>4.1 Evaluación: ¿Activar al 20% el viernes?</w:t>
       </w:r>
     </w:p>
     <w:p>
       <w:r>
-        <w:t>1. Salud del Pipeline: 3 roturas de CI por tests inestables; tiempo medio de build: 1m 45s; 1 rollback manual crítico por healthcheck colgado.</w:t>
+        <w:t>• Decisión: RECHAZAR LA ACTIVACIÓN.</w:t>
         <w:br/>
-        <w:t>2. Disciplina TBD: Solo 4 integraciones en el sprint (meta: diaria); 1 rama vivió 4 días por miedo al CI rojo; 3 toggles técnicos acumulaban &gt; 45 días sin retirar.</w:t>
-        <w:br/>
-        <w:t>3. Flujo de Valor: Lead Time for Changes se infló a 9 días; el valor no había llegado al usuario final por temor a la activación sin métricas.</w:t>
+        <w:t>• Justificación Técnica: Incumple las ventanas seguras de despliegue (no liberar antes del fin de semana sin guardia técnica activa); existe un antecedente reciente de fallo en health check; y no existe telemetría para monitorear caídas o transacciones bancarias fallidas.</w:t>
       </w:r>
     </w:p>
     <w:p>
@@ -1463,1276 +440,48 @@
         <w:pStyle w:val="Heading2"/>
       </w:pPr>
       <w:r>
-        <w:t>4.2 Tablero de Retrospectiva (Miro)</w:t>
+        <w:t>4.2 Estrategia de Liberación Progresiva (Canary Rollout)</w:t>
       </w:r>
     </w:p>
-    <w:tbl>
-      <w:tblPr>
-        <w:tblW w:type="auto" w:w="0"/>
-        <w:jc w:val="center"/>
-        <w:tblLook w:firstColumn="1" w:firstRow="1" w:lastColumn="0" w:lastRow="0" w:noHBand="0" w:noVBand="1" w:val="04A0"/>
-      </w:tblPr>
-      <w:tblGrid>
-        <w:gridCol w:w="3120"/>
-        <w:gridCol w:w="3120"/>
-        <w:gridCol w:w="3120"/>
-      </w:tblGrid>
-      <w:tr>
-        <w:tc>
-          <w:tcPr>
-            <w:tcW w:type="dxa" w:w="3024"/>
-            <w:shd w:fill="1A365D"/>
-            <w:tcMar>
-              <w:top w:w="120" w:type="dxa"/>
-              <w:bottom w:w="120" w:type="dxa"/>
-              <w:left w:w="140" w:type="dxa"/>
-              <w:right w:w="140" w:type="dxa"/>
-            </w:tcMar>
-          </w:tcPr>
-          <w:p>
-            <w:pPr>
-              <w:jc w:val="center"/>
-            </w:pPr>
-            <w:r>
-              <w:rPr>
-                <w:rFonts w:ascii="Arial" w:hAnsi="Arial"/>
-                <w:b/>
-                <w:color w:val="FFFFFF"/>
-                <w:sz w:val="19"/>
-              </w:rPr>
-              <w:t>🟢 Lo que Funcionó Bien</w:t>
-            </w:r>
-          </w:p>
-        </w:tc>
-        <w:tc>
-          <w:tcPr>
-            <w:tcW w:type="dxa" w:w="3168"/>
-            <w:shd w:fill="1A365D"/>
-            <w:tcMar>
-              <w:top w:w="120" w:type="dxa"/>
-              <w:bottom w:w="120" w:type="dxa"/>
-              <w:left w:w="140" w:type="dxa"/>
-              <w:right w:w="140" w:type="dxa"/>
-            </w:tcMar>
-          </w:tcPr>
-          <w:p>
-            <w:pPr>
-              <w:jc w:val="center"/>
-            </w:pPr>
-            <w:r>
-              <w:rPr>
-                <w:rFonts w:ascii="Arial" w:hAnsi="Arial"/>
-                <w:b/>
-                <w:color w:val="FFFFFF"/>
-                <w:sz w:val="19"/>
-              </w:rPr>
-              <w:t>🟡 Lo que Generó Fricción</w:t>
-            </w:r>
-          </w:p>
-        </w:tc>
-        <w:tc>
-          <w:tcPr>
-            <w:tcW w:type="dxa" w:w="3168"/>
-            <w:shd w:fill="1A365D"/>
-            <w:tcMar>
-              <w:top w:w="120" w:type="dxa"/>
-              <w:bottom w:w="120" w:type="dxa"/>
-              <w:left w:w="140" w:type="dxa"/>
-              <w:right w:w="140" w:type="dxa"/>
-            </w:tcMar>
-          </w:tcPr>
-          <w:p>
-            <w:pPr>
-              <w:jc w:val="center"/>
-            </w:pPr>
-            <w:r>
-              <w:rPr>
-                <w:rFonts w:ascii="Arial" w:hAnsi="Arial"/>
-                <w:b/>
-                <w:color w:val="FFFFFF"/>
-                <w:sz w:val="19"/>
-              </w:rPr>
-              <w:t>🔴 Lo que Rompió el Flujo / Causó Miedo</w:t>
-            </w:r>
-          </w:p>
-        </w:tc>
-      </w:tr>
-      <w:tr>
-        <w:tc>
-          <w:tcPr>
-            <w:tcW w:type="dxa" w:w="3024"/>
-            <w:shd w:fill="FFFFFF"/>
-            <w:tcMar>
-              <w:top w:w="80" w:type="dxa"/>
-              <w:bottom w:w="80" w:type="dxa"/>
-              <w:left w:w="120" w:type="dxa"/>
-              <w:right w:w="120" w:type="dxa"/>
-            </w:tcMar>
-          </w:tcPr>
-          <w:p>
-            <w:pPr>
-              <w:jc w:val="left"/>
-            </w:pPr>
-            <w:r>
-              <w:rPr>
-                <w:rFonts w:ascii="Arial" w:hAnsi="Arial"/>
-                <w:color w:val="282828"/>
-                <w:sz w:val="18"/>
-              </w:rPr>
-              <w:t>• Auto-deploy a Render rápido y fluido.</w:t>
-              <w:br/>
-              <w:t>• Uso de ConfigCat para aislar el código en main.</w:t>
-              <w:br/>
-              <w:t>• Linter Ruff ejecutándose en &lt; 3s.</w:t>
-            </w:r>
-          </w:p>
-        </w:tc>
-        <w:tc>
-          <w:tcPr>
-            <w:tcW w:type="dxa" w:w="3168"/>
-            <w:shd w:fill="FFFFFF"/>
-            <w:tcMar>
-              <w:top w:w="80" w:type="dxa"/>
-              <w:bottom w:w="80" w:type="dxa"/>
-              <w:left w:w="120" w:type="dxa"/>
-              <w:right w:w="120" w:type="dxa"/>
-            </w:tcMar>
-          </w:tcPr>
-          <w:p>
-            <w:r>
-              <w:rPr>
-                <w:rFonts w:ascii="Arial" w:hAnsi="Arial"/>
-                <w:color w:val="282828"/>
-                <w:sz w:val="18"/>
-              </w:rPr>
-              <w:t>• Presión comercial del PO sin métricas previas.</w:t>
-              <w:br/>
-              <w:t>• 3 toggles obsoletos que confundían el código.</w:t>
-              <w:br/>
-              <w:t>• Tiempos muertos esperando revisiones de PR.</w:t>
-            </w:r>
-          </w:p>
-        </w:tc>
-        <w:tc>
-          <w:tcPr>
-            <w:tcW w:type="dxa" w:w="3168"/>
-            <w:shd w:fill="FFFFFF"/>
-            <w:tcMar>
-              <w:top w:w="80" w:type="dxa"/>
-              <w:bottom w:w="80" w:type="dxa"/>
-              <w:left w:w="120" w:type="dxa"/>
-              <w:right w:w="120" w:type="dxa"/>
-            </w:tcMar>
-          </w:tcPr>
-          <w:p>
-            <w:r>
-              <w:rPr>
-                <w:rFonts w:ascii="Arial" w:hAnsi="Arial"/>
-                <w:color w:val="282828"/>
-                <w:sz w:val="18"/>
-              </w:rPr>
-              <w:t>• Test flaky bloqueó una rama por 4 días.</w:t>
-              <w:br/>
-              <w:t>• Healthcheck colgado provocó 11 min de caída.</w:t>
-              <w:br/>
-              <w:t>• Anuncio comercial prematuro sin release real.</w:t>
-            </w:r>
-          </w:p>
-        </w:tc>
-      </w:tr>
-    </w:tbl>
     <w:p>
-      <w:pPr>
-        <w:spacing w:after="200"/>
-      </w:pPr>
+      <w:r>
+        <w:t>1. Fase 0 (Interno / Dogfooding - Lunes): Activación al 100% exclusivamente para correos y cuentas del equipo de desarrollo, QA y Product Owner en ConfigCat.</w:t>
+        <w:br/>
+        <w:t>2. Fase 1 (Canary 5% - Martes): Activación para el 5% de usuarios reales en horario laboral diurno, manteniendo monitoreo activo por 24 horas.</w:t>
+        <w:br/>
+        <w:t>3. Fase 2 (Escalado Gradual - Miércoles a Jueves): Si la tasa de transacciones fallidas permanece inferior al 0.5%, escalar progresivamente a 20%, 50% y finalmente 100%.</w:t>
+      </w:r>
     </w:p>
     <w:p>
       <w:pPr>
         <w:pStyle w:val="Heading2"/>
       </w:pPr>
       <w:r>
-        <w:t>4.3 Acciones de Mejora Oficiales (Máximo 3 Acciones Concretas)</w:t>
+        <w:t>4.3 Protocolo de Monitoreo y Rollback Inmediato</w:t>
       </w:r>
     </w:p>
-    <w:tbl>
-      <w:tblPr>
-        <w:tblW w:type="auto" w:w="0"/>
-        <w:jc w:val="center"/>
-        <w:tblLook w:firstColumn="1" w:firstRow="1" w:lastColumn="0" w:lastRow="0" w:noHBand="0" w:noVBand="1" w:val="04A0"/>
-      </w:tblPr>
-      <w:tblGrid>
-        <w:gridCol w:w="2340"/>
-        <w:gridCol w:w="2340"/>
-        <w:gridCol w:w="2340"/>
-        <w:gridCol w:w="2340"/>
-      </w:tblGrid>
-      <w:tr>
-        <w:tc>
-          <w:tcPr>
-            <w:tcW w:type="dxa" w:w="2592"/>
-            <w:shd w:fill="0A2540"/>
-            <w:tcMar>
-              <w:top w:w="120" w:type="dxa"/>
-              <w:bottom w:w="120" w:type="dxa"/>
-              <w:left w:w="140" w:type="dxa"/>
-              <w:right w:w="140" w:type="dxa"/>
-            </w:tcMar>
-          </w:tcPr>
-          <w:p>
-            <w:pPr>
-              <w:jc w:val="center"/>
-            </w:pPr>
-            <w:r>
-              <w:rPr>
-                <w:rFonts w:ascii="Arial" w:hAnsi="Arial"/>
-                <w:b/>
-                <w:color w:val="FFFFFF"/>
-                <w:sz w:val="19"/>
-              </w:rPr>
-              <w:t>Acción de Mejora</w:t>
-            </w:r>
-          </w:p>
-        </w:tc>
-        <w:tc>
-          <w:tcPr>
-            <w:tcW w:type="dxa" w:w="2016"/>
-            <w:shd w:fill="0A2540"/>
-            <w:tcMar>
-              <w:top w:w="120" w:type="dxa"/>
-              <w:bottom w:w="120" w:type="dxa"/>
-              <w:left w:w="140" w:type="dxa"/>
-              <w:right w:w="140" w:type="dxa"/>
-            </w:tcMar>
-          </w:tcPr>
-          <w:p>
-            <w:pPr>
-              <w:jc w:val="center"/>
-            </w:pPr>
-            <w:r>
-              <w:rPr>
-                <w:rFonts w:ascii="Arial" w:hAnsi="Arial"/>
-                <w:b/>
-                <w:color w:val="FFFFFF"/>
-                <w:sz w:val="19"/>
-              </w:rPr>
-              <w:t>Responsable</w:t>
-            </w:r>
-          </w:p>
-        </w:tc>
-        <w:tc>
-          <w:tcPr>
-            <w:tcW w:type="dxa" w:w="1584"/>
-            <w:shd w:fill="0A2540"/>
-            <w:tcMar>
-              <w:top w:w="120" w:type="dxa"/>
-              <w:bottom w:w="120" w:type="dxa"/>
-              <w:left w:w="140" w:type="dxa"/>
-              <w:right w:w="140" w:type="dxa"/>
-            </w:tcMar>
-          </w:tcPr>
-          <w:p>
-            <w:pPr>
-              <w:jc w:val="center"/>
-            </w:pPr>
-            <w:r>
-              <w:rPr>
-                <w:rFonts w:ascii="Arial" w:hAnsi="Arial"/>
-                <w:b/>
-                <w:color w:val="FFFFFF"/>
-                <w:sz w:val="19"/>
-              </w:rPr>
-              <w:t>Plazo</w:t>
-            </w:r>
-          </w:p>
-        </w:tc>
-        <w:tc>
-          <w:tcPr>
-            <w:tcW w:type="dxa" w:w="3168"/>
-            <w:shd w:fill="0A2540"/>
-            <w:tcMar>
-              <w:top w:w="120" w:type="dxa"/>
-              <w:bottom w:w="120" w:type="dxa"/>
-              <w:left w:w="140" w:type="dxa"/>
-              <w:right w:w="140" w:type="dxa"/>
-            </w:tcMar>
-          </w:tcPr>
-          <w:p>
-            <w:pPr>
-              <w:jc w:val="center"/>
-            </w:pPr>
-            <w:r>
-              <w:rPr>
-                <w:rFonts w:ascii="Arial" w:hAnsi="Arial"/>
-                <w:b/>
-                <w:color w:val="FFFFFF"/>
-                <w:sz w:val="19"/>
-              </w:rPr>
-              <w:t>Definition of Done (DoD)</w:t>
-            </w:r>
-          </w:p>
-        </w:tc>
-      </w:tr>
-      <w:tr>
-        <w:tc>
-          <w:tcPr>
-            <w:tcW w:type="dxa" w:w="2592"/>
-            <w:shd w:fill="FFFFFF"/>
-            <w:tcMar>
-              <w:top w:w="80" w:type="dxa"/>
-              <w:bottom w:w="80" w:type="dxa"/>
-              <w:left w:w="120" w:type="dxa"/>
-              <w:right w:w="120" w:type="dxa"/>
-            </w:tcMar>
-          </w:tcPr>
-          <w:p>
-            <w:pPr>
-              <w:jc w:val="left"/>
-            </w:pPr>
-            <w:r>
-              <w:rPr>
-                <w:rFonts w:ascii="Arial" w:hAnsi="Arial"/>
-                <w:color w:val="282828"/>
-                <w:sz w:val="18"/>
-              </w:rPr>
-              <w:t>1. Cuarentena y Erradicación de Tests Flaky</w:t>
-            </w:r>
-          </w:p>
-        </w:tc>
-        <w:tc>
-          <w:tcPr>
-            <w:tcW w:type="dxa" w:w="2016"/>
-            <w:shd w:fill="FFFFFF"/>
-            <w:tcMar>
-              <w:top w:w="80" w:type="dxa"/>
-              <w:bottom w:w="80" w:type="dxa"/>
-              <w:left w:w="120" w:type="dxa"/>
-              <w:right w:w="120" w:type="dxa"/>
-            </w:tcMar>
-          </w:tcPr>
-          <w:p>
-            <w:r>
-              <w:rPr>
-                <w:rFonts w:ascii="Arial" w:hAnsi="Arial"/>
-                <w:color w:val="282828"/>
-                <w:sz w:val="18"/>
-              </w:rPr>
-              <w:t>Franklin Córdoba (Tech Lead)</w:t>
-            </w:r>
-          </w:p>
-        </w:tc>
-        <w:tc>
-          <w:tcPr>
-            <w:tcW w:type="dxa" w:w="1584"/>
-            <w:shd w:fill="FFFFFF"/>
-            <w:tcMar>
-              <w:top w:w="80" w:type="dxa"/>
-              <w:bottom w:w="80" w:type="dxa"/>
-              <w:left w:w="120" w:type="dxa"/>
-              <w:right w:w="120" w:type="dxa"/>
-            </w:tcMar>
-          </w:tcPr>
-          <w:p>
-            <w:r>
-              <w:rPr>
-                <w:rFonts w:ascii="Arial" w:hAnsi="Arial"/>
-                <w:color w:val="282828"/>
-                <w:sz w:val="18"/>
-              </w:rPr>
-              <w:t>Inmediato</w:t>
-            </w:r>
-          </w:p>
-        </w:tc>
-        <w:tc>
-          <w:tcPr>
-            <w:tcW w:type="dxa" w:w="3168"/>
-            <w:shd w:fill="FFFFFF"/>
-            <w:tcMar>
-              <w:top w:w="80" w:type="dxa"/>
-              <w:bottom w:w="80" w:type="dxa"/>
-              <w:left w:w="120" w:type="dxa"/>
-              <w:right w:w="120" w:type="dxa"/>
-            </w:tcMar>
-          </w:tcPr>
-          <w:p>
-            <w:r>
-              <w:rPr>
-                <w:rFonts w:ascii="Arial" w:hAnsi="Arial"/>
-                <w:color w:val="282828"/>
-                <w:sz w:val="18"/>
-              </w:rPr>
-              <w:t>Tests inestables aislados en &lt; 2h. Suite CI 100% determinista en &lt; 15s.</w:t>
-            </w:r>
-          </w:p>
-        </w:tc>
-      </w:tr>
-      <w:tr>
-        <w:tc>
-          <w:tcPr>
-            <w:tcW w:type="dxa" w:w="2592"/>
-            <w:shd w:fill="F8FAFC"/>
-            <w:tcMar>
-              <w:top w:w="80" w:type="dxa"/>
-              <w:bottom w:w="80" w:type="dxa"/>
-              <w:left w:w="120" w:type="dxa"/>
-              <w:right w:w="120" w:type="dxa"/>
-            </w:tcMar>
-          </w:tcPr>
-          <w:p>
-            <w:pPr>
-              <w:jc w:val="left"/>
-            </w:pPr>
-            <w:r>
-              <w:rPr>
-                <w:rFonts w:ascii="Arial" w:hAnsi="Arial"/>
-                <w:color w:val="282828"/>
-                <w:sz w:val="18"/>
-              </w:rPr>
-              <w:t>2. Healthcheck Desacoplado y Resiliente</w:t>
-            </w:r>
-          </w:p>
-        </w:tc>
-        <w:tc>
-          <w:tcPr>
-            <w:tcW w:type="dxa" w:w="2016"/>
-            <w:shd w:fill="F8FAFC"/>
-            <w:tcMar>
-              <w:top w:w="80" w:type="dxa"/>
-              <w:bottom w:w="80" w:type="dxa"/>
-              <w:left w:w="120" w:type="dxa"/>
-              <w:right w:w="120" w:type="dxa"/>
-            </w:tcMar>
-          </w:tcPr>
-          <w:p>
-            <w:r>
-              <w:rPr>
-                <w:rFonts w:ascii="Arial" w:hAnsi="Arial"/>
-                <w:color w:val="282828"/>
-                <w:sz w:val="18"/>
-              </w:rPr>
-              <w:t>DevOps Engineer</w:t>
-            </w:r>
-          </w:p>
-        </w:tc>
-        <w:tc>
-          <w:tcPr>
-            <w:tcW w:type="dxa" w:w="1584"/>
-            <w:shd w:fill="F8FAFC"/>
-            <w:tcMar>
-              <w:top w:w="80" w:type="dxa"/>
-              <w:bottom w:w="80" w:type="dxa"/>
-              <w:left w:w="120" w:type="dxa"/>
-              <w:right w:w="120" w:type="dxa"/>
-            </w:tcMar>
-          </w:tcPr>
-          <w:p>
-            <w:r>
-              <w:rPr>
-                <w:rFonts w:ascii="Arial" w:hAnsi="Arial"/>
-                <w:color w:val="282828"/>
-                <w:sz w:val="18"/>
-              </w:rPr>
-              <w:t>24 Horas</w:t>
-            </w:r>
-          </w:p>
-        </w:tc>
-        <w:tc>
-          <w:tcPr>
-            <w:tcW w:type="dxa" w:w="3168"/>
-            <w:shd w:fill="F8FAFC"/>
-            <w:tcMar>
-              <w:top w:w="80" w:type="dxa"/>
-              <w:bottom w:w="80" w:type="dxa"/>
-              <w:left w:w="120" w:type="dxa"/>
-              <w:right w:w="120" w:type="dxa"/>
-            </w:tcMar>
-          </w:tcPr>
-          <w:p>
-            <w:r>
-              <w:rPr>
-                <w:rFonts w:ascii="Arial" w:hAnsi="Arial"/>
-                <w:color w:val="282828"/>
-                <w:sz w:val="18"/>
-              </w:rPr>
-              <w:t>Endpoint /health responde en &lt; 10ms sin dependencias bloqueantes.</w:t>
-            </w:r>
-          </w:p>
-        </w:tc>
-      </w:tr>
-      <w:tr>
-        <w:tc>
-          <w:tcPr>
-            <w:tcW w:type="dxa" w:w="2592"/>
-            <w:shd w:fill="FFFFFF"/>
-            <w:tcMar>
-              <w:top w:w="80" w:type="dxa"/>
-              <w:bottom w:w="80" w:type="dxa"/>
-              <w:left w:w="120" w:type="dxa"/>
-              <w:right w:w="120" w:type="dxa"/>
-            </w:tcMar>
-          </w:tcPr>
-          <w:p>
-            <w:pPr>
-              <w:jc w:val="left"/>
-            </w:pPr>
-            <w:r>
-              <w:rPr>
-                <w:rFonts w:ascii="Arial" w:hAnsi="Arial"/>
-                <w:color w:val="282828"/>
-                <w:sz w:val="18"/>
-              </w:rPr>
-              <w:t>3. Política de Limpieza de Toggles Obsoletos</w:t>
-            </w:r>
-          </w:p>
-        </w:tc>
-        <w:tc>
-          <w:tcPr>
-            <w:tcW w:type="dxa" w:w="2016"/>
-            <w:shd w:fill="FFFFFF"/>
-            <w:tcMar>
-              <w:top w:w="80" w:type="dxa"/>
-              <w:bottom w:w="80" w:type="dxa"/>
-              <w:left w:w="120" w:type="dxa"/>
-              <w:right w:w="120" w:type="dxa"/>
-            </w:tcMar>
-          </w:tcPr>
-          <w:p>
-            <w:r>
-              <w:rPr>
-                <w:rFonts w:ascii="Arial" w:hAnsi="Arial"/>
-                <w:color w:val="282828"/>
-                <w:sz w:val="18"/>
-              </w:rPr>
-              <w:t>PO + Dev Team</w:t>
-            </w:r>
-          </w:p>
-        </w:tc>
-        <w:tc>
-          <w:tcPr>
-            <w:tcW w:type="dxa" w:w="1584"/>
-            <w:shd w:fill="FFFFFF"/>
-            <w:tcMar>
-              <w:top w:w="80" w:type="dxa"/>
-              <w:bottom w:w="80" w:type="dxa"/>
-              <w:left w:w="120" w:type="dxa"/>
-              <w:right w:w="120" w:type="dxa"/>
-            </w:tcMar>
-          </w:tcPr>
-          <w:p>
-            <w:r>
-              <w:rPr>
-                <w:rFonts w:ascii="Arial" w:hAnsi="Arial"/>
-                <w:color w:val="282828"/>
-                <w:sz w:val="18"/>
-              </w:rPr>
-              <w:t>Fin de Sprint</w:t>
-            </w:r>
-          </w:p>
-        </w:tc>
-        <w:tc>
-          <w:tcPr>
-            <w:tcW w:type="dxa" w:w="3168"/>
-            <w:shd w:fill="FFFFFF"/>
-            <w:tcMar>
-              <w:top w:w="80" w:type="dxa"/>
-              <w:bottom w:w="80" w:type="dxa"/>
-              <w:left w:w="120" w:type="dxa"/>
-              <w:right w:w="120" w:type="dxa"/>
-            </w:tcMar>
-          </w:tcPr>
-          <w:p>
-            <w:r>
-              <w:rPr>
-                <w:rFonts w:ascii="Arial" w:hAnsi="Arial"/>
-                <w:color w:val="282828"/>
-                <w:sz w:val="18"/>
-              </w:rPr>
-              <w:t>Eliminar los 3 toggles &gt; 45 días. Caducidad máxima de 30 días en Playbook.</w:t>
-            </w:r>
-          </w:p>
-        </w:tc>
-      </w:tr>
-    </w:tbl>
     <w:p>
-      <w:pPr>
-        <w:spacing w:after="200"/>
-      </w:pPr>
+      <w:r>
+        <w:t>• Métricas bajo Observación: Tasa de errores HTTP 5xx, latencia p95 (umbral máximo 800 ms) y tasa de pagos fallidos en pasarela.</w:t>
+        <w:br/>
+        <w:t>• Criterio de Rollback: Si los errores superan el 1% o la latencia excede el umbral, se conmuta el toggle pagos-express-v1 a OFF inmediatamente desde ConfigCat, neutralizando el impacto en menos de 60 segundos sin necesidad de un nuevo deploy o commit.</w:t>
+      </w:r>
     </w:p>
     <w:p>
       <w:pPr>
         <w:pStyle w:val="Heading1"/>
       </w:pPr>
       <w:r>
-        <w:t>5. Liberación Segura de Valor (Canary Rollout)</w:t>
+        <w:t>5. CONCLUSIONES Y CIERRE</w:t>
       </w:r>
     </w:p>
     <w:p>
       <w:r>
-        <w:t>Se diseñó una estrategia de liberación progresiva para 'pagos-express-v1' que permite conciliar la urgencia comercial de la campaña con la estabilidad absoluta del sistema en producción:</w:t>
-      </w:r>
-    </w:p>
-    <w:tbl>
-      <w:tblPr>
-        <w:tblW w:type="auto" w:w="0"/>
-        <w:jc w:val="center"/>
-        <w:tblLook w:firstColumn="1" w:firstRow="1" w:lastColumn="0" w:lastRow="0" w:noHBand="0" w:noVBand="1" w:val="04A0"/>
-      </w:tblPr>
-      <w:tblGrid>
-        <w:gridCol w:w="2340"/>
-        <w:gridCol w:w="2340"/>
-        <w:gridCol w:w="2340"/>
-        <w:gridCol w:w="2340"/>
-      </w:tblGrid>
-      <w:tr>
-        <w:tc>
-          <w:tcPr>
-            <w:tcW w:type="dxa" w:w="1728"/>
-            <w:shd w:fill="0A2540"/>
-            <w:tcMar>
-              <w:top w:w="120" w:type="dxa"/>
-              <w:bottom w:w="120" w:type="dxa"/>
-              <w:left w:w="140" w:type="dxa"/>
-              <w:right w:w="140" w:type="dxa"/>
-            </w:tcMar>
-          </w:tcPr>
-          <w:p>
-            <w:pPr>
-              <w:jc w:val="center"/>
-            </w:pPr>
-            <w:r>
-              <w:rPr>
-                <w:rFonts w:ascii="Arial" w:hAnsi="Arial"/>
-                <w:b/>
-                <w:color w:val="FFFFFF"/>
-                <w:sz w:val="19"/>
-              </w:rPr>
-              <w:t>Fase</w:t>
-            </w:r>
-          </w:p>
-        </w:tc>
-        <w:tc>
-          <w:tcPr>
-            <w:tcW w:type="dxa" w:w="2592"/>
-            <w:shd w:fill="0A2540"/>
-            <w:tcMar>
-              <w:top w:w="120" w:type="dxa"/>
-              <w:bottom w:w="120" w:type="dxa"/>
-              <w:left w:w="140" w:type="dxa"/>
-              <w:right w:w="140" w:type="dxa"/>
-            </w:tcMar>
-          </w:tcPr>
-          <w:p>
-            <w:pPr>
-              <w:jc w:val="center"/>
-            </w:pPr>
-            <w:r>
-              <w:rPr>
-                <w:rFonts w:ascii="Arial" w:hAnsi="Arial"/>
-                <w:b/>
-                <w:color w:val="FFFFFF"/>
-                <w:sz w:val="19"/>
-              </w:rPr>
-              <w:t>Audiencia Objetivo</w:t>
-            </w:r>
-          </w:p>
-        </w:tc>
-        <w:tc>
-          <w:tcPr>
-            <w:tcW w:type="dxa" w:w="2592"/>
-            <w:shd w:fill="0A2540"/>
-            <w:tcMar>
-              <w:top w:w="120" w:type="dxa"/>
-              <w:bottom w:w="120" w:type="dxa"/>
-              <w:left w:w="140" w:type="dxa"/>
-              <w:right w:w="140" w:type="dxa"/>
-            </w:tcMar>
-          </w:tcPr>
-          <w:p>
-            <w:pPr>
-              <w:jc w:val="center"/>
-            </w:pPr>
-            <w:r>
-              <w:rPr>
-                <w:rFonts w:ascii="Arial" w:hAnsi="Arial"/>
-                <w:b/>
-                <w:color w:val="FFFFFF"/>
-                <w:sz w:val="19"/>
-              </w:rPr>
-              <w:t>Propósito</w:t>
-            </w:r>
-          </w:p>
-        </w:tc>
-        <w:tc>
-          <w:tcPr>
-            <w:tcW w:type="dxa" w:w="2448"/>
-            <w:shd w:fill="0A2540"/>
-            <w:tcMar>
-              <w:top w:w="120" w:type="dxa"/>
-              <w:bottom w:w="120" w:type="dxa"/>
-              <w:left w:w="140" w:type="dxa"/>
-              <w:right w:w="140" w:type="dxa"/>
-            </w:tcMar>
-          </w:tcPr>
-          <w:p>
-            <w:pPr>
-              <w:jc w:val="center"/>
-            </w:pPr>
-            <w:r>
-              <w:rPr>
-                <w:rFonts w:ascii="Arial" w:hAnsi="Arial"/>
-                <w:b/>
-                <w:color w:val="FFFFFF"/>
-                <w:sz w:val="19"/>
-              </w:rPr>
-              <w:t>Criterio de Avance</w:t>
-            </w:r>
-          </w:p>
-        </w:tc>
-      </w:tr>
-      <w:tr>
-        <w:tc>
-          <w:tcPr>
-            <w:tcW w:type="dxa" w:w="1728"/>
-            <w:shd w:fill="FFFFFF"/>
-            <w:tcMar>
-              <w:top w:w="80" w:type="dxa"/>
-              <w:bottom w:w="80" w:type="dxa"/>
-              <w:left w:w="120" w:type="dxa"/>
-              <w:right w:w="120" w:type="dxa"/>
-            </w:tcMar>
-          </w:tcPr>
-          <w:p>
-            <w:pPr>
-              <w:jc w:val="left"/>
-            </w:pPr>
-            <w:r>
-              <w:rPr>
-                <w:rFonts w:ascii="Arial" w:hAnsi="Arial"/>
-                <w:color w:val="282828"/>
-                <w:sz w:val="18"/>
-              </w:rPr>
-              <w:t>Fase 0: Alpha</w:t>
-            </w:r>
-          </w:p>
-        </w:tc>
-        <w:tc>
-          <w:tcPr>
-            <w:tcW w:type="dxa" w:w="2592"/>
-            <w:shd w:fill="FFFFFF"/>
-            <w:tcMar>
-              <w:top w:w="80" w:type="dxa"/>
-              <w:bottom w:w="80" w:type="dxa"/>
-              <w:left w:w="120" w:type="dxa"/>
-              <w:right w:w="120" w:type="dxa"/>
-            </w:tcMar>
-          </w:tcPr>
-          <w:p>
-            <w:r>
-              <w:rPr>
-                <w:rFonts w:ascii="Arial" w:hAnsi="Arial"/>
-                <w:color w:val="282828"/>
-                <w:sz w:val="18"/>
-              </w:rPr>
-              <w:t>Usuarios internos (@empresa.com)</w:t>
-            </w:r>
-          </w:p>
-        </w:tc>
-        <w:tc>
-          <w:tcPr>
-            <w:tcW w:type="dxa" w:w="2592"/>
-            <w:shd w:fill="FFFFFF"/>
-            <w:tcMar>
-              <w:top w:w="80" w:type="dxa"/>
-              <w:bottom w:w="80" w:type="dxa"/>
-              <w:left w:w="120" w:type="dxa"/>
-              <w:right w:w="120" w:type="dxa"/>
-            </w:tcMar>
-          </w:tcPr>
-          <w:p>
-            <w:r>
-              <w:rPr>
-                <w:rFonts w:ascii="Arial" w:hAnsi="Arial"/>
-                <w:color w:val="282828"/>
-                <w:sz w:val="18"/>
-              </w:rPr>
-              <w:t>Validar integración en Render sin riesgo a clientes.</w:t>
-            </w:r>
-          </w:p>
-        </w:tc>
-        <w:tc>
-          <w:tcPr>
-            <w:tcW w:type="dxa" w:w="2448"/>
-            <w:shd w:fill="FFFFFF"/>
-            <w:tcMar>
-              <w:top w:w="80" w:type="dxa"/>
-              <w:bottom w:w="80" w:type="dxa"/>
-              <w:left w:w="120" w:type="dxa"/>
-              <w:right w:w="120" w:type="dxa"/>
-            </w:tcMar>
-          </w:tcPr>
-          <w:p>
-            <w:r>
-              <w:rPr>
-                <w:rFonts w:ascii="Arial" w:hAnsi="Arial"/>
-                <w:color w:val="282828"/>
-                <w:sz w:val="18"/>
-              </w:rPr>
-              <w:t>100% compras internas exitosas.</w:t>
-            </w:r>
-          </w:p>
-        </w:tc>
-      </w:tr>
-      <w:tr>
-        <w:tc>
-          <w:tcPr>
-            <w:tcW w:type="dxa" w:w="1728"/>
-            <w:shd w:fill="F8FAFC"/>
-            <w:tcMar>
-              <w:top w:w="80" w:type="dxa"/>
-              <w:bottom w:w="80" w:type="dxa"/>
-              <w:left w:w="120" w:type="dxa"/>
-              <w:right w:w="120" w:type="dxa"/>
-            </w:tcMar>
-          </w:tcPr>
-          <w:p>
-            <w:pPr>
-              <w:jc w:val="left"/>
-            </w:pPr>
-            <w:r>
-              <w:rPr>
-                <w:rFonts w:ascii="Arial" w:hAnsi="Arial"/>
-                <w:color w:val="282828"/>
-                <w:sz w:val="18"/>
-              </w:rPr>
-              <w:t>Fase 1: Beta</w:t>
-            </w:r>
-          </w:p>
-        </w:tc>
-        <w:tc>
-          <w:tcPr>
-            <w:tcW w:type="dxa" w:w="2592"/>
-            <w:shd w:fill="F8FAFC"/>
-            <w:tcMar>
-              <w:top w:w="80" w:type="dxa"/>
-              <w:bottom w:w="80" w:type="dxa"/>
-              <w:left w:w="120" w:type="dxa"/>
-              <w:right w:w="120" w:type="dxa"/>
-            </w:tcMar>
-          </w:tcPr>
-          <w:p>
-            <w:r>
-              <w:rPr>
-                <w:rFonts w:ascii="Arial" w:hAnsi="Arial"/>
-                <w:color w:val="282828"/>
-                <w:sz w:val="18"/>
-              </w:rPr>
-              <w:t>5% usuarios aleatorios reales</w:t>
-            </w:r>
-          </w:p>
-        </w:tc>
-        <w:tc>
-          <w:tcPr>
-            <w:tcW w:type="dxa" w:w="2592"/>
-            <w:shd w:fill="F8FAFC"/>
-            <w:tcMar>
-              <w:top w:w="80" w:type="dxa"/>
-              <w:bottom w:w="80" w:type="dxa"/>
-              <w:left w:w="120" w:type="dxa"/>
-              <w:right w:w="120" w:type="dxa"/>
-            </w:tcMar>
-          </w:tcPr>
-          <w:p>
-            <w:r>
-              <w:rPr>
-                <w:rFonts w:ascii="Arial" w:hAnsi="Arial"/>
-                <w:color w:val="282828"/>
-                <w:sz w:val="18"/>
-              </w:rPr>
-              <w:t>Monitoreo intensivo de 2 horas en vivo.</w:t>
-            </w:r>
-          </w:p>
-        </w:tc>
-        <w:tc>
-          <w:tcPr>
-            <w:tcW w:type="dxa" w:w="2448"/>
-            <w:shd w:fill="F8FAFC"/>
-            <w:tcMar>
-              <w:top w:w="80" w:type="dxa"/>
-              <w:bottom w:w="80" w:type="dxa"/>
-              <w:left w:w="120" w:type="dxa"/>
-              <w:right w:w="120" w:type="dxa"/>
-            </w:tcMar>
-          </w:tcPr>
-          <w:p>
-            <w:r>
-              <w:rPr>
-                <w:rFonts w:ascii="Arial" w:hAnsi="Arial"/>
-                <w:color w:val="282828"/>
-                <w:sz w:val="18"/>
-              </w:rPr>
-              <w:t>Error rate &lt; 0.5%, latencia &lt; 600ms.</w:t>
-            </w:r>
-          </w:p>
-        </w:tc>
-      </w:tr>
-      <w:tr>
-        <w:tc>
-          <w:tcPr>
-            <w:tcW w:type="dxa" w:w="1728"/>
-            <w:shd w:fill="FFFFFF"/>
-            <w:tcMar>
-              <w:top w:w="80" w:type="dxa"/>
-              <w:bottom w:w="80" w:type="dxa"/>
-              <w:left w:w="120" w:type="dxa"/>
-              <w:right w:w="120" w:type="dxa"/>
-            </w:tcMar>
-          </w:tcPr>
-          <w:p>
-            <w:pPr>
-              <w:jc w:val="left"/>
-            </w:pPr>
-            <w:r>
-              <w:rPr>
-                <w:rFonts w:ascii="Arial" w:hAnsi="Arial"/>
-                <w:color w:val="282828"/>
-                <w:sz w:val="18"/>
-              </w:rPr>
-              <w:t>Fase 2: Comercial</w:t>
-            </w:r>
-          </w:p>
-        </w:tc>
-        <w:tc>
-          <w:tcPr>
-            <w:tcW w:type="dxa" w:w="2592"/>
-            <w:shd w:fill="FFFFFF"/>
-            <w:tcMar>
-              <w:top w:w="80" w:type="dxa"/>
-              <w:bottom w:w="80" w:type="dxa"/>
-              <w:left w:w="120" w:type="dxa"/>
-              <w:right w:w="120" w:type="dxa"/>
-            </w:tcMar>
-          </w:tcPr>
-          <w:p>
-            <w:r>
-              <w:rPr>
-                <w:rFonts w:ascii="Arial" w:hAnsi="Arial"/>
-                <w:color w:val="282828"/>
-                <w:sz w:val="18"/>
-              </w:rPr>
-              <w:t>20% usuarios (Campaña Marketing)</w:t>
-            </w:r>
-          </w:p>
-        </w:tc>
-        <w:tc>
-          <w:tcPr>
-            <w:tcW w:type="dxa" w:w="2592"/>
-            <w:shd w:fill="FFFFFF"/>
-            <w:tcMar>
-              <w:top w:w="80" w:type="dxa"/>
-              <w:bottom w:w="80" w:type="dxa"/>
-              <w:left w:w="120" w:type="dxa"/>
-              <w:right w:w="120" w:type="dxa"/>
-            </w:tcMar>
-          </w:tcPr>
-          <w:p>
-            <w:r>
-              <w:rPr>
-                <w:rFonts w:ascii="Arial" w:hAnsi="Arial"/>
-                <w:color w:val="282828"/>
-                <w:sz w:val="18"/>
-              </w:rPr>
-              <w:t>Satisfacer la campaña del PO bajo control.</w:t>
-            </w:r>
-          </w:p>
-        </w:tc>
-        <w:tc>
-          <w:tcPr>
-            <w:tcW w:type="dxa" w:w="2448"/>
-            <w:shd w:fill="FFFFFF"/>
-            <w:tcMar>
-              <w:top w:w="80" w:type="dxa"/>
-              <w:bottom w:w="80" w:type="dxa"/>
-              <w:left w:w="120" w:type="dxa"/>
-              <w:right w:w="120" w:type="dxa"/>
-            </w:tcMar>
-          </w:tcPr>
-          <w:p>
-            <w:r>
-              <w:rPr>
-                <w:rFonts w:ascii="Arial" w:hAnsi="Arial"/>
-                <w:color w:val="282828"/>
-                <w:sz w:val="18"/>
-              </w:rPr>
-              <w:t>Conversión &gt; 92% tras 6 horas.</w:t>
-            </w:r>
-          </w:p>
-        </w:tc>
-      </w:tr>
-      <w:tr>
-        <w:tc>
-          <w:tcPr>
-            <w:tcW w:type="dxa" w:w="1728"/>
-            <w:shd w:fill="F8FAFC"/>
-            <w:tcMar>
-              <w:top w:w="80" w:type="dxa"/>
-              <w:bottom w:w="80" w:type="dxa"/>
-              <w:left w:w="120" w:type="dxa"/>
-              <w:right w:w="120" w:type="dxa"/>
-            </w:tcMar>
-          </w:tcPr>
-          <w:p>
-            <w:pPr>
-              <w:jc w:val="left"/>
-            </w:pPr>
-            <w:r>
-              <w:rPr>
-                <w:rFonts w:ascii="Arial" w:hAnsi="Arial"/>
-                <w:color w:val="282828"/>
-                <w:sz w:val="18"/>
-              </w:rPr>
-              <w:t>Fase 3: Expansión</w:t>
-            </w:r>
-          </w:p>
-        </w:tc>
-        <w:tc>
-          <w:tcPr>
-            <w:tcW w:type="dxa" w:w="2592"/>
-            <w:shd w:fill="F8FAFC"/>
-            <w:tcMar>
-              <w:top w:w="80" w:type="dxa"/>
-              <w:bottom w:w="80" w:type="dxa"/>
-              <w:left w:w="120" w:type="dxa"/>
-              <w:right w:w="120" w:type="dxa"/>
-            </w:tcMar>
-          </w:tcPr>
-          <w:p>
-            <w:r>
-              <w:rPr>
-                <w:rFonts w:ascii="Arial" w:hAnsi="Arial"/>
-                <w:color w:val="282828"/>
-                <w:sz w:val="18"/>
-              </w:rPr>
-              <w:t>50% de la base de usuarios</w:t>
-            </w:r>
-          </w:p>
-        </w:tc>
-        <w:tc>
-          <w:tcPr>
-            <w:tcW w:type="dxa" w:w="2592"/>
-            <w:shd w:fill="F8FAFC"/>
-            <w:tcMar>
-              <w:top w:w="80" w:type="dxa"/>
-              <w:bottom w:w="80" w:type="dxa"/>
-              <w:left w:w="120" w:type="dxa"/>
-              <w:right w:w="120" w:type="dxa"/>
-            </w:tcMar>
-          </w:tcPr>
-          <w:p>
-            <w:r>
-              <w:rPr>
-                <w:rFonts w:ascii="Arial" w:hAnsi="Arial"/>
-                <w:color w:val="282828"/>
-                <w:sz w:val="18"/>
-              </w:rPr>
-              <w:t>Validar comportamiento a escala media.</w:t>
-            </w:r>
-          </w:p>
-        </w:tc>
-        <w:tc>
-          <w:tcPr>
-            <w:tcW w:type="dxa" w:w="2448"/>
-            <w:shd w:fill="F8FAFC"/>
-            <w:tcMar>
-              <w:top w:w="80" w:type="dxa"/>
-              <w:bottom w:w="80" w:type="dxa"/>
-              <w:left w:w="120" w:type="dxa"/>
-              <w:right w:w="120" w:type="dxa"/>
-            </w:tcMar>
-          </w:tcPr>
-          <w:p>
-            <w:r>
-              <w:rPr>
-                <w:rFonts w:ascii="Arial" w:hAnsi="Arial"/>
-                <w:color w:val="282828"/>
-                <w:sz w:val="18"/>
-              </w:rPr>
-              <w:t>Estabilidad tras 24 horas.</w:t>
-            </w:r>
-          </w:p>
-        </w:tc>
-      </w:tr>
-      <w:tr>
-        <w:tc>
-          <w:tcPr>
-            <w:tcW w:type="dxa" w:w="1728"/>
-            <w:shd w:fill="FFFFFF"/>
-            <w:tcMar>
-              <w:top w:w="80" w:type="dxa"/>
-              <w:bottom w:w="80" w:type="dxa"/>
-              <w:left w:w="120" w:type="dxa"/>
-              <w:right w:w="120" w:type="dxa"/>
-            </w:tcMar>
-          </w:tcPr>
-          <w:p>
-            <w:pPr>
-              <w:jc w:val="left"/>
-            </w:pPr>
-            <w:r>
-              <w:rPr>
-                <w:rFonts w:ascii="Arial" w:hAnsi="Arial"/>
-                <w:color w:val="282828"/>
-                <w:sz w:val="18"/>
-              </w:rPr>
-              <w:t>Fase 4: 100% GA</w:t>
-            </w:r>
-          </w:p>
-        </w:tc>
-        <w:tc>
-          <w:tcPr>
-            <w:tcW w:type="dxa" w:w="2592"/>
-            <w:shd w:fill="FFFFFF"/>
-            <w:tcMar>
-              <w:top w:w="80" w:type="dxa"/>
-              <w:bottom w:w="80" w:type="dxa"/>
-              <w:left w:w="120" w:type="dxa"/>
-              <w:right w:w="120" w:type="dxa"/>
-            </w:tcMar>
-          </w:tcPr>
-          <w:p>
-            <w:r>
-              <w:rPr>
-                <w:rFonts w:ascii="Arial" w:hAnsi="Arial"/>
-                <w:color w:val="282828"/>
-                <w:sz w:val="18"/>
-              </w:rPr>
-              <w:t>Todos los usuarios</w:t>
-            </w:r>
-          </w:p>
-        </w:tc>
-        <w:tc>
-          <w:tcPr>
-            <w:tcW w:type="dxa" w:w="2592"/>
-            <w:shd w:fill="FFFFFF"/>
-            <w:tcMar>
-              <w:top w:w="80" w:type="dxa"/>
-              <w:bottom w:w="80" w:type="dxa"/>
-              <w:left w:w="120" w:type="dxa"/>
-              <w:right w:w="120" w:type="dxa"/>
-            </w:tcMar>
-          </w:tcPr>
-          <w:p>
-            <w:r>
-              <w:rPr>
-                <w:rFonts w:ascii="Arial" w:hAnsi="Arial"/>
-                <w:color w:val="282828"/>
-                <w:sz w:val="18"/>
-              </w:rPr>
-              <w:t>Disponibilidad general y agenda de cleanup.</w:t>
-            </w:r>
-          </w:p>
-        </w:tc>
-        <w:tc>
-          <w:tcPr>
-            <w:tcW w:type="dxa" w:w="2448"/>
-            <w:shd w:fill="FFFFFF"/>
-            <w:tcMar>
-              <w:top w:w="80" w:type="dxa"/>
-              <w:bottom w:w="80" w:type="dxa"/>
-              <w:left w:w="120" w:type="dxa"/>
-              <w:right w:w="120" w:type="dxa"/>
-            </w:tcMar>
-          </w:tcPr>
-          <w:p>
-            <w:r>
-              <w:rPr>
-                <w:rFonts w:ascii="Arial" w:hAnsi="Arial"/>
-                <w:color w:val="282828"/>
-                <w:sz w:val="18"/>
-              </w:rPr>
-              <w:t>Cierre formal del release.</w:t>
-            </w:r>
-          </w:p>
-        </w:tc>
-      </w:tr>
-    </w:tbl>
-    <w:p>
-      <w:pPr>
-        <w:spacing w:after="200"/>
-      </w:pPr>
-    </w:p>
-    <w:tbl>
-      <w:tblPr>
-        <w:tblW w:type="auto" w:w="0"/>
-        <w:jc w:val="center"/>
-        <w:tblLook w:firstColumn="1" w:firstRow="1" w:lastColumn="0" w:lastRow="0" w:noHBand="0" w:noVBand="1" w:val="04A0"/>
-      </w:tblPr>
-      <w:tblGrid>
-        <w:gridCol w:w="9360"/>
-      </w:tblGrid>
-      <w:tr>
-        <w:tc>
-          <w:tcPr>
-            <w:tcW w:type="dxa" w:w="9360"/>
-            <w:shd w:fill="FFF5F5"/>
-            <w:tcMar>
-              <w:top w:w="140" w:type="dxa"/>
-              <w:bottom w:w="140" w:type="dxa"/>
-              <w:left w:w="200" w:type="dxa"/>
-              <w:right w:w="180" w:type="dxa"/>
-            </w:tcMar>
-            <w:tcBorders>
-              <w:top w:val="none"/>
-              <w:left w:val="single" w:sz="24" w:space="0" w:color="CC0000"/>
-              <w:bottom w:val="none"/>
-              <w:right w:val="none"/>
-            </w:tcBorders>
-          </w:tcPr>
-          <w:p>
-            <w:pPr>
-              <w:spacing w:before="40" w:after="40"/>
-            </w:pPr>
-            <w:r>
-              <w:rPr>
-                <w:rFonts w:ascii="Arial" w:hAnsi="Arial"/>
-                <w:b/>
-                <w:color w:val="0A2540"/>
-                <w:sz w:val="20"/>
-              </w:rPr>
-              <w:t xml:space="preserve">📌 PROTOCOLO DE KILL-SWITCH INMEDIATO: </w:t>
-            </w:r>
-            <w:r>
-              <w:rPr>
-                <w:rFonts w:ascii="Arial" w:hAnsi="Arial"/>
-                <w:color w:val="28323C"/>
-                <w:sz w:val="20"/>
-              </w:rPr>
-              <w:t>Si durante el rollout el Error Rate supera el 1.5% o la latencia supera 1.5 segundos, cualquier miembro del equipo o el PO apaga el toggle 'pagos-express-v1' a 0% en ConfigCat inmediatamente. Tiempo de mitigación: &lt; 30 segundos, sin necesidad de redeploy ni de rollback de contenedor.</w:t>
-            </w:r>
-          </w:p>
-        </w:tc>
-      </w:tr>
-    </w:tbl>
-    <w:p/>
-    <w:p>
-      <w:pPr>
-        <w:pStyle w:val="Heading1"/>
-      </w:pPr>
-      <w:r>
-        <w:t>6. Actualización del Playbook y Cierre de Fase 1</w:t>
-      </w:r>
-    </w:p>
-    <w:p>
-      <w:r>
-        <w:t>Se procedió a la actualización oficial del documento 'SCRUM_TBD_PLAYBOOK_v3.md', integrando formalmente:</w:t>
+        <w:t>1. El Continuous Deployment exige desacoplar el despliegue técnico (automatizado por el pipeline hacia Render) de la liberación de valor (controlada por el Product Owner mediante ConfigCat).</w:t>
         <w:br/>
-        <w:t>• El protocolo y estructura del nuevo Sprint Review en Continuous Deployment.</w:t>
+        <w:t>2. El Sprint Review deja de ser una entrega de fin de ciclo para convertirse en una sesión de validación de valor e hipótesis sobre el entorno de producción real.</w:t>
         <w:br/>
-        <w:t>• El protocolo y los 3 ejes obligatorios de la nueva Sprint Retrospective.</w:t>
-        <w:br/>
-        <w:t>• La política de gobernanza y ciclo de vida de Feature Toggles (expiración a los 30 días).</w:t>
-        <w:br/>
-        <w:t>• El protocolo de cuarentena de tests flaky.</w:t>
-        <w:br/>
-        <w:t>• El cierre al 100% de la Fase 1 del diplomado.</w:t>
+        <w:t>3. La Sprint Retrospective se transforma en un espacio de auditoría del pipeline, asegurando ramas cortas, pruebas estables y eliminación de deuda técnica en toggles.</w:t>
       </w:r>
     </w:p>
     <w:tbl>
@@ -2757,7 +506,7 @@
             </w:tcMar>
             <w:tcBorders>
               <w:top w:val="none"/>
-              <w:left w:val="single" w:sz="24" w:space="0" w:color="00AA66"/>
+              <w:left w:val="single" w:sz="24" w:space="0" w:color="00D4B2"/>
               <w:bottom w:val="none"/>
               <w:right w:val="none"/>
             </w:tcBorders>
@@ -2773,7 +522,7 @@
                 <w:color w:val="0A2540"/>
                 <w:sz w:val="20"/>
               </w:rPr>
-              <w:t xml:space="preserve">📌 RONDA FINAL - FRASE DE TRANSFORMACIÓN: </w:t>
+              <w:t xml:space="preserve">📌 FRASE X OFICIAL: </w:t>
             </w:r>
             <w:r>
               <w:rPr>
@@ -2781,70 +530,13 @@
                 <w:color w:val="28323C"/>
                 <w:sz w:val="20"/>
               </w:rPr>
-              <w:t>“A partir de este taller, el Sprint Review deja de ser una entrega de código para convertirse en una validación científica de valor en producción, y la Retrospectiva pasa de discutir impresiones a optimizar matemáticamente la salud del pipeline y el flujo continuo.”</w:t>
+              <w:t>“Desplegar a producción ya no es un evento de cierre de sprint, sino una rutina continua e invisible; el Review valida el impacto del valor real y la Retrospectiva protege la salud del pipeline y la disciplina diaria de integración.”</w:t>
             </w:r>
           </w:p>
         </w:tc>
       </w:tr>
     </w:tbl>
     <w:p/>
-    <w:p>
-      <w:pPr>
-        <w:pStyle w:val="Heading1"/>
-      </w:pPr>
-      <w:r>
-        <w:t>7. Evidencias de Validación Técnica Automatizada</w:t>
-      </w:r>
-    </w:p>
-    <w:p>
-      <w:r>
-        <w:t>A continuación, se certifica la ejecución exitosa de la suite completa de pruebas unitarias y de integración en el entorno local y en el pipeline de GitHub Actions:</w:t>
-      </w:r>
-    </w:p>
-    <w:p>
-      <w:r>
-        <w:rPr>
-          <w:rFonts w:ascii="Consolas" w:hAnsi="Consolas"/>
-          <w:color w:val="141E28"/>
-          <w:sz w:val="17"/>
-        </w:rPr>
-        <w:t>============================= test session starts =============================</w:t>
-        <w:br/>
-        <w:t>collected 13 items</w:t>
-        <w:br/>
-        <w:br/>
-        <w:t>tests/test_health.py::test_root_endpoint PASSED                          [  7%]</w:t>
-        <w:br/>
-        <w:t>tests/test_health.py::test_health_check_proactive PASSED                 [ 15%]</w:t>
-        <w:br/>
-        <w:t>tests/test_health.py::test_metrics_endpoint PASSED                       [ 23%]</w:t>
-        <w:br/>
-        <w:t>tests/test_health.py::test_toggles_admin_audit PASSED                    [ 30%]</w:t>
-        <w:br/>
-        <w:t>tests/test_health.py::test_cleanup_stale_toggles PASSED                  [ 38%]</w:t>
-        <w:br/>
-        <w:t>tests/test_payments.py::test_standard_checkout_when_toggle_is_off PASSED [ 46%]</w:t>
-        <w:br/>
-        <w:t>tests/test_payments.py::test_express_checkout_when_toggle_is_on PASSED   [ 53%]</w:t>
-        <w:br/>
-        <w:t>tests/test_payments.py::test_checkout_invalid_amount PASSED              [ 61%]</w:t>
-        <w:br/>
-        <w:t>tests/test_payments.py::test_flaky_test_elimination_deterministic PASSED [ 69%]</w:t>
-        <w:br/>
-        <w:t>tests/test_toggles.py::test_default_toggle_state_is_off PASSED           [ 76%]</w:t>
-        <w:br/>
-        <w:t>tests/test_toggles.py::test_toggle_override_to_on PASSED                 [ 84%]</w:t>
-        <w:br/>
-        <w:t>tests/test_toggles.py::test_internal_user_canary_whitelisting PASSED     [ 92%]</w:t>
-        <w:br/>
-        <w:t>tests/test_toggles.py::test_user_specific_override PASSED                [100%]</w:t>
-        <w:br/>
-        <w:br/>
-        <w:t>======================== 13 passed in 0.51s ========================</w:t>
-        <w:br/>
-        <w:t>Ruff Linter: All checks passed! (0 errors, 0 warnings)</w:t>
-      </w:r>
-    </w:p>
     <w:sectPr>
       <w:pgSz w:w="12240" w:h="15840"/>
       <w:pgMar w:top="1440" w:right="1440" w:bottom="1440" w:left="1440" w:header="720" w:footer="720" w:gutter="0"/>

</xml_diff>

<commit_message>
docs & feat: integrar solucion oficial del caso pagos express, sprint review, retro y liberacion segura
</commit_message>
<xml_diff>
--- a/INFORME_TALLER_6_CONTINUOUS_DEPLOYMENT.docx
+++ b/INFORME_TALLER_6_CONTINUOUS_DEPLOYMENT.docx
@@ -55,6 +55,8 @@
         <w:t>Stack Tecnológico: React 18, Vite, TypeScript, ConfigCat SDK, Render</w:t>
         <w:br/>
         <w:t>Caso Técnico: 'Pagos Express en Liquidación de Trámites Catastrales'</w:t>
+        <w:br/>
+        <w:t>Repositorio: https://github.com/franklincordoba2001-ops/taller-6-continuous-deployment</w:t>
       </w:r>
     </w:p>
     <w:p>
@@ -106,7 +108,7 @@
         <w:spacing w:after="240"/>
       </w:pPr>
       <w:r>
-        <w:t>El presente informe documenta la adaptación práctica de las ceremonias ágiles de Scrum (Sprint Review y Sprint Retrospective) al modelo de Continuous Deployment (CD) y Trunk-Based Development (TBD), resolviendo el caso técnico de 'Pagos Express' mediante el desacople entre despliegue y liberación con Feature Flags y una estrategia de liberación controlada.</w:t>
+        <w:t>El presente informe documenta la resolución técnica y metodológica del caso de estudio de 'Pagos Express' en el marco del Taller 6: Continuous Deployment, Sprint Review &amp; Retrospective. El objetivo central es adaptar las ceremonias de Scrum (Sprint Review y Sprint Retrospective) y las políticas de liberación a un modelo maduro de Continuous Deployment (CD) y Trunk-Based Development (TBD), desacoplando el despliegue técnico a Render de la liberación al usuario final mediante Feature Toggles en ConfigCat.</w:t>
       </w:r>
     </w:p>
     <w:p>
@@ -114,7 +116,7 @@
         <w:pStyle w:val="Heading1"/>
       </w:pPr>
       <w:r>
-        <w:t>2. ADAPTACIÓN DEL SPRINT REVIEW A CONTINUOUS DEPLOYMENT</w:t>
+        <w:t>2. EN EL SPRINT REVIEW</w:t>
       </w:r>
     </w:p>
     <w:p>
@@ -122,7 +124,7 @@
         <w:pStyle w:val="Heading2"/>
       </w:pPr>
       <w:r>
-        <w:t>2.1 Principios Comparativos</w:t>
+        <w:t>2.1 Principios Comparativos: Review Clásico vs. Review en Continuous Deployment</w:t>
       </w:r>
     </w:p>
     <w:p>
@@ -138,38 +140,85 @@
         <w:pStyle w:val="Heading2"/>
       </w:pPr>
       <w:r>
-        <w:t>2.2 Ficha Técnica de Demostración (Caso: Pagos Express)</w:t>
+        <w:t>2.2 Protocolo de Demostración y Comunicación en el Review (Caso: Pagos Express)</w:t>
       </w:r>
     </w:p>
     <w:p>
       <w:r>
-        <w:t>• Problema Resuelto: Elimina la fricción y abandono en la liquidación de trámites catastrales mediante un checkout rápido de 1 clic con firma digital autorizada, evitando formularios bancarios repetitivos.</w:t>
+        <w:t>1. Demo con el toggle en OFF primero (estado real actual):</w:t>
+        <w:br/>
+        <w:t xml:space="preserve">   Se proyecta la aplicación directamente en Render mostrando la experiencia real y actual de los usuarios (formulario estándar de liquidación), demostrando que el código ya reside en la rama main y en producción sin alterar el comportamiento de los ciudadanos ni generar riesgo alguno.</w:t>
         <w:br/>
         <w:br/>
-        <w:t>• Estado en Producción: Código integrado a la rama main y desplegado en Render, aislado detrás del flag pagos-express-v1 (en estado OFF).</w:t>
+        <w:t>2. Activación temporal restringida:</w:t>
+        <w:br/>
+        <w:t xml:space="preserve">   Luego se activa temporalmente solo para el equipo (o un usuario de prueba) y se muestra el flujo de 'Pagar en 1 Clic con Pagos Express', demostrando la conmutación instantánea del componente sin requerir nuevos commits, compilaciones ni redespliegues.</w:t>
         <w:br/>
         <w:br/>
-        <w:t>• Flujo de la Demo en Vivo:</w:t>
+        <w:t>3. Gestión rigurosa de expectativas:</w:t>
         <w:br/>
-        <w:t xml:space="preserve">  1. Estado OFF: Se proyecta la aplicación en Render mostrando la pasarela estándar ('Completar formulario y Pagar') con el flag inactivo.</w:t>
-        <w:br/>
-        <w:t xml:space="preserve">  2. Conmutación: Se conmuta el toggle pagos-express-v1 a ON en la consola de ConfigCat y se publica el cambio.</w:t>
-        <w:br/>
-        <w:t xml:space="preserve">  3. Estado ON: Sin requerir nuevo commit, compilación ni redespliegue, la interfaz actualiza dinámicamente el componente a 'Pagar en 1 Clic con Pagos Express'.</w:t>
-        <w:br/>
-        <w:br/>
-        <w:t>• Métricas de Éxito: Reducción del tiempo de liquidación (de 3 minutos a menos de 10 segundos), tasa de conversión en pasarela y tasa de error técnico inferior al 0.5%.</w:t>
-        <w:br/>
-        <w:br/>
-        <w:t>• Pregunta de Validación al PO/Stakeholders: “¿La confirmación en un clic resuelve la necesidad del ciudadano antes de abrir el tráfico al 100%?”</w:t>
+        <w:t xml:space="preserve">   Se evita comprometer una fecha de activación al 20% en el Review, condicionando la liberación a métricas y estabilidad demostrada.</w:t>
       </w:r>
     </w:p>
+    <w:tbl>
+      <w:tblPr>
+        <w:tblW w:type="auto" w:w="0"/>
+        <w:jc w:val="center"/>
+        <w:tblLook w:firstColumn="1" w:firstRow="1" w:lastColumn="0" w:lastRow="0" w:noHBand="0" w:noVBand="1" w:val="04A0"/>
+      </w:tblPr>
+      <w:tblGrid>
+        <w:gridCol w:w="9360"/>
+      </w:tblGrid>
+      <w:tr>
+        <w:tc>
+          <w:tcPr>
+            <w:tcW w:type="dxa" w:w="9360"/>
+            <w:shd w:fill="F0F7FF"/>
+            <w:tcMar>
+              <w:top w:w="140" w:type="dxa"/>
+              <w:bottom w:w="140" w:type="dxa"/>
+              <w:left w:w="200" w:type="dxa"/>
+              <w:right w:w="180" w:type="dxa"/>
+            </w:tcMar>
+            <w:tcBorders>
+              <w:top w:val="none"/>
+              <w:left w:val="single" w:sz="24" w:space="0" w:color="0066CC"/>
+              <w:bottom w:val="none"/>
+              <w:right w:val="none"/>
+            </w:tcBorders>
+          </w:tcPr>
+          <w:p>
+            <w:pPr>
+              <w:spacing w:before="40" w:after="40"/>
+            </w:pPr>
+            <w:r>
+              <w:rPr>
+                <w:rFonts w:ascii="Arial" w:hAnsi="Arial"/>
+                <w:b/>
+                <w:color w:val="0A2540"/>
+                <w:sz w:val="20"/>
+              </w:rPr>
+              <w:t xml:space="preserve">📌 DECLARACIÓN TRANSPARENTE DEL PRODUCT OWNER (PO): </w:t>
+            </w:r>
+            <w:r>
+              <w:rPr>
+                <w:rFonts w:ascii="Arial" w:hAnsi="Arial"/>
+                <w:color w:val="28323C"/>
+                <w:sz w:val="20"/>
+              </w:rPr>
+              <w:t>“La funcionalidad está técnicamente lista y desplegada, pero todavía no la hemos liberado a usuarios reales porque necesitamos definir métricas de observación y resolver riesgos de estabilidad del pipeline. La campaña de marketing se pausará o se ajustará.”</w:t>
+            </w:r>
+          </w:p>
+        </w:tc>
+      </w:tr>
+    </w:tbl>
+    <w:p/>
     <w:p>
       <w:pPr>
         <w:pStyle w:val="Heading1"/>
       </w:pPr>
       <w:r>
-        <w:t>3. ADAPTACIÓN DE LA SPRINT RETROSPECTIVE</w:t>
+        <w:t>3. EN LA SPRINT RETROSPECTIVE (ACCIONES CONCRETAS)</w:t>
       </w:r>
     </w:p>
     <w:p>
@@ -177,7 +226,7 @@
         <w:pStyle w:val="Heading2"/>
       </w:pPr>
       <w:r>
-        <w:t>3.1 Nuevos Focos de Inspección Obligatoria</w:t>
+        <w:t>3.1 Nuevos Focos de Inspección Obligatoria en CD</w:t>
       </w:r>
     </w:p>
     <w:p>
@@ -188,7 +237,7 @@
         <w:br/>
         <w:t>• Disciplina TBD: Integraciones diarias a main, tiempo de vida de ramas (&lt; 24 horas) e higiene/retiro de feature flags.</w:t>
         <w:br/>
-        <w:t>• Flujo de Valor: Lead Time for Changes y tiempo efectivo en que el usuario recibe valor.</w:t>
+        <w:t>• Flujo de Valor: Lead Time for Changes y tiempo efectivo en que el usuario recibe valor con observabilidad activa.</w:t>
       </w:r>
     </w:p>
     <w:p>
@@ -196,26 +245,7 @@
         <w:pStyle w:val="Heading2"/>
       </w:pPr>
       <w:r>
-        <w:t>3.2 Diagnóstico del Caso (Sprint Retrospective)</w:t>
-      </w:r>
-    </w:p>
-    <w:p>
-      <w:r>
-        <w:t>• Salud del Pipeline: Se presentó un fallo de health check por 11 minutos durante el último deploy automático que requirió rollback manual; existencia de tests intermitentes (flaky tests) en el CI.</w:t>
-        <w:br/>
-        <w:t>• Disciplina TBD: Se redujo el ritmo a solo 4 integraciones en el sprint; una rama permaneció abierta 4 días para sortear el test flaky del CI.</w:t>
-        <w:br/>
-        <w:t>• Higiene de Toggles: Existen 3 feature toggles con más de 45 días de vida sin retirar del código base.</w:t>
-        <w:br/>
-        <w:t>• Flujo de Valor: Presión comercial por activar el toggle al 20% en viernes sin instrumentar métricas de error de pasarela ni conversión.</w:t>
-      </w:r>
-    </w:p>
-    <w:p>
-      <w:pPr>
-        <w:pStyle w:val="Heading2"/>
-      </w:pPr>
-      <w:r>
-        <w:t>3.3 Matriz de Retrospectiva (Estructura Miro)</w:t>
+        <w:t>3.2 Matriz de Retrospectiva (Estructura Miro)</w:t>
       </w:r>
     </w:p>
     <w:tbl>
@@ -331,6 +361,8 @@
               <w:t>• Despliegue automático a Render cumpliendo DoD técnico.</w:t>
               <w:br/>
               <w:t>• Aislamiento efectivo de código sin riesgo al usuario final mediante pagos-express-v1 en ConfigCat.</w:t>
+              <w:br/>
+              <w:t>• Separación de deploy y release.</w:t>
             </w:r>
           </w:p>
         </w:tc>
@@ -354,7 +386,7 @@
               </w:rPr>
               <w:t>• Tests flaky en CI que demoraron integraciones.</w:t>
               <w:br/>
-              <w:t>• Presión comercial del PO por activar en viernes sin observabilidad.</w:t>
+              <w:t>• Presión comercial del PO / Marketing por activar en viernes sin observabilidad.</w:t>
               <w:br/>
               <w:t>• Solo 4 integraciones en el sprint.</w:t>
             </w:r>
@@ -378,9 +410,9 @@
                 <w:color w:val="282828"/>
                 <w:sz w:val="18"/>
               </w:rPr>
-              <w:t>• Caída de 11 minutos por health check fallido.</w:t>
+              <w:t>• Caída de 11 minutos por health check fallido en el último deploy.</w:t>
               <w:br/>
-              <w:t>• Rollback manual no automatizado.</w:t>
+              <w:t>• Rollback manual no automatizado ante fallo de servicio.</w:t>
               <w:br/>
               <w:t>• Acumulación de 3 toggles obsoletos (+45 días).</w:t>
             </w:r>
@@ -398,26 +430,85 @@
         <w:pStyle w:val="Heading2"/>
       </w:pPr>
       <w:r>
-        <w:t>3.4 Tres Acciones de Mejora Obligatorias</w:t>
+        <w:t>3.3 Las Tres Acciones Concretas de Mejora Inmediata</w:t>
       </w:r>
     </w:p>
     <w:p>
       <w:r>
-        <w:t>1. Acción 1 (Estabilidad de Pipeline): Cuarentenar de inmediato el test flaky del CI y configurar auto-rollback en Render ante fallos de health check. (Responsable: Developers).</w:t>
+        <w:t>• Acción 1: Arreglar el test flaky en las próximas 24 h (máxima prioridad).</w:t>
+        <w:br/>
+        <w:t xml:space="preserve">  Responsable: Developers. Aislar, refactorizar o mockear de inmediato el test intermitente que bloqueó el CI por 4 días, restableciendo la confianza en las pruebas automáticas.</w:t>
         <w:br/>
         <w:br/>
-        <w:t>2. Acción 2 (Higiene de Toggles): Incorporar al Definition of Done (DoD) que todo toggle con más de 30 días en producción se priorice obligatoriamente como tarea de limpieza en el backlog. (Responsable: Equipo / PO).</w:t>
+        <w:t>• Acción 2: Crear un dashboard mínimo de métricas de pagos (errores + conversión) antes de cualquier activación.</w:t>
+        <w:br/>
+        <w:t xml:space="preserve">  Responsable: Devs + PO. Implementar telemetría en tiempo real sobre errores HTTP 5xx/pasarela y tasa de conversión antes de liberar tráfico externo.</w:t>
         <w:br/>
         <w:br/>
-        <w:t>3. Acción 3 (DoR de Liberación): Definir como criterio en el Definition of Ready (DoR) que ninguna funcionalidad se active a usuarios externos sin dashboards activos de errores HTTP 5xx y latencia. (Responsable: PO + Devs).</w:t>
+        <w:t>• Acción 3: Limpiar o eliminar los 3 toggles antiguos en este mismo sprint.</w:t>
+        <w:br/>
+        <w:t xml:space="preserve">  Responsable: Equipo / PO. Erradicar del código base los 3 feature toggles con más de 45 días de vida para pagar la deuda técnica acumulada.</w:t>
       </w:r>
     </w:p>
+    <w:tbl>
+      <w:tblPr>
+        <w:tblW w:type="auto" w:w="0"/>
+        <w:jc w:val="center"/>
+        <w:tblLook w:firstColumn="1" w:firstRow="1" w:lastColumn="0" w:lastRow="0" w:noHBand="0" w:noVBand="1" w:val="04A0"/>
+      </w:tblPr>
+      <w:tblGrid>
+        <w:gridCol w:w="9360"/>
+      </w:tblGrid>
+      <w:tr>
+        <w:tc>
+          <w:tcPr>
+            <w:tcW w:type="dxa" w:w="9360"/>
+            <w:shd w:fill="FFFBEB"/>
+            <w:tcMar>
+              <w:top w:w="140" w:type="dxa"/>
+              <w:bottom w:w="140" w:type="dxa"/>
+              <w:left w:w="200" w:type="dxa"/>
+              <w:right w:w="180" w:type="dxa"/>
+            </w:tcMar>
+            <w:tcBorders>
+              <w:top w:val="none"/>
+              <w:left w:val="single" w:sz="24" w:space="0" w:color="D97706"/>
+              <w:bottom w:val="none"/>
+              <w:right w:val="none"/>
+            </w:tcBorders>
+          </w:tcPr>
+          <w:p>
+            <w:pPr>
+              <w:spacing w:before="40" w:after="40"/>
+            </w:pPr>
+            <w:r>
+              <w:rPr>
+                <w:rFonts w:ascii="Arial" w:hAnsi="Arial"/>
+                <w:b/>
+                <w:color w:val="0A2540"/>
+                <w:sz w:val="20"/>
+              </w:rPr>
+              <w:t xml:space="preserve">📌 ACUERDO VINCULANTE DE EQUIPO (RETROSPECTIVA): </w:t>
+            </w:r>
+            <w:r>
+              <w:rPr>
+                <w:rFonts w:ascii="Arial" w:hAnsi="Arial"/>
+                <w:color w:val="28323C"/>
+                <w:sz w:val="20"/>
+              </w:rPr>
+              <w:t>“No se activará ningún toggle nuevo a usuarios reales hasta que el health check no haya fallado en los últimos 7 deploys.”</w:t>
+            </w:r>
+          </w:p>
+        </w:tc>
+      </w:tr>
+    </w:tbl>
+    <w:p/>
     <w:p>
       <w:pPr>
         <w:pStyle w:val="Heading1"/>
       </w:pPr>
       <w:r>
-        <w:t>4. POLÍTICA DE LIBERACIÓN SEGURA DE VALOR</w:t>
+        <w:t>4. ESTRATEGIA DE LIBERACIÓN SEGURA (DECISIÓN FINAL)</w:t>
       </w:r>
     </w:p>
     <w:p>
@@ -425,14 +516,14 @@
         <w:pStyle w:val="Heading2"/>
       </w:pPr>
       <w:r>
-        <w:t>4.1 Evaluación: ¿Activar al 20% el viernes?</w:t>
+        <w:t>4.1 Evaluación de Decisión: ¿Activar al 20% el Viernes?</w:t>
       </w:r>
     </w:p>
     <w:p>
       <w:r>
-        <w:t>• Decisión: RECHAZAR LA ACTIVACIÓN.</w:t>
+        <w:t>• Decisión Final: NO SE ACTIVA EL 20% ESTE VIERNES.</w:t>
         <w:br/>
-        <w:t>• Justificación Técnica: Incumple las ventanas seguras de despliegue (no liberar antes del fin de semana sin guardia técnica activa); existe un antecedente reciente de fallo en health check; y no existe telemetría para monitorear caídas o transacciones bancarias fallidas.</w:t>
+        <w:t>• Justificación Técnica: Incumple las ventanas seguras de despliegue (no liberar antes del fin de semana sin guardia técnica activa); existe un antecedente reciente de fallo de 11 minutos en health check durante el último deploy; persisten tests flaky en CI; y no existe telemetría previa para monitorear caídas o pagos fallidos.</w:t>
       </w:r>
     </w:p>
     <w:p>
@@ -440,48 +531,143 @@
         <w:pStyle w:val="Heading2"/>
       </w:pPr>
       <w:r>
-        <w:t>4.2 Estrategia de Liberación Progresiva (Canary Rollout)</w:t>
+        <w:t>4.2 Plan Acordado de Liberación Progresiva (5 Pasos)</w:t>
       </w:r>
     </w:p>
     <w:p>
       <w:r>
-        <w:t>1. Fase 0 (Interno / Dogfooding - Lunes): Activación al 100% exclusivamente para correos y cuentas del equipo de desarrollo, QA y Product Owner en ConfigCat.</w:t>
+        <w:t>1. Paso 1: Resolver test flaky + limpiar toggles viejos (esta semana).</w:t>
         <w:br/>
-        <w:t>2. Fase 1 (Canary 5% - Martes): Activación para el 5% de usuarios reales en horario laboral diurno, manteniendo monitoreo activo por 24 horas.</w:t>
+        <w:t>2. Paso 2: Implementar métricas básicas de error y conversión (máximo 3 días).</w:t>
         <w:br/>
-        <w:t>3. Fase 2 (Escalado Gradual - Miércoles a Jueves): Si la tasa de transacciones fallidas permanece inferior al 0.5%, escalar progresivamente a 20%, 50% y finalmente 100%.</w:t>
+        <w:t>3. Paso 3: Activar primero solo para usuarios internos / equipo (1-2 días de observación).</w:t>
+        <w:br/>
+        <w:t>4. Paso 4: Si todo está estable → subir al 5% → 20% con observación de 48 h en cada paso.</w:t>
+        <w:br/>
+        <w:t>5. Paso 5: Criterio de rollback automático: cualquier aumento &gt; 0,5% en errores de pago activa de inmediato el apagado del toggle en ConfigCat en menos de 60 segundos.</w:t>
       </w:r>
     </w:p>
-    <w:p>
-      <w:pPr>
-        <w:pStyle w:val="Heading2"/>
-      </w:pPr>
-      <w:r>
-        <w:t>4.3 Protocolo de Monitoreo y Rollback Inmediato</w:t>
-      </w:r>
-    </w:p>
-    <w:p>
-      <w:r>
-        <w:t>• Métricas bajo Observación: Tasa de errores HTTP 5xx, latencia p95 (umbral máximo 800 ms) y tasa de pagos fallidos en pasarela.</w:t>
-        <w:br/>
-        <w:t>• Criterio de Rollback: Si los errores superan el 1% o la latencia excede el umbral, se conmuta el toggle pagos-express-v1 a OFF inmediatamente desde ConfigCat, neutralizando el impacto en menos de 60 segundos sin necesidad de un nuevo deploy o commit.</w:t>
-      </w:r>
-    </w:p>
+    <w:tbl>
+      <w:tblPr>
+        <w:tblW w:type="auto" w:w="0"/>
+        <w:jc w:val="center"/>
+        <w:tblLook w:firstColumn="1" w:firstRow="1" w:lastColumn="0" w:lastRow="0" w:noHBand="0" w:noVBand="1" w:val="04A0"/>
+      </w:tblPr>
+      <w:tblGrid>
+        <w:gridCol w:w="9360"/>
+      </w:tblGrid>
+      <w:tr>
+        <w:tc>
+          <w:tcPr>
+            <w:tcW w:type="dxa" w:w="9360"/>
+            <w:shd w:fill="ECFDF5"/>
+            <w:tcMar>
+              <w:top w:w="140" w:type="dxa"/>
+              <w:bottom w:w="140" w:type="dxa"/>
+              <w:left w:w="200" w:type="dxa"/>
+              <w:right w:w="180" w:type="dxa"/>
+            </w:tcMar>
+            <w:tcBorders>
+              <w:top w:val="none"/>
+              <w:left w:val="single" w:sz="24" w:space="0" w:color="10B981"/>
+              <w:bottom w:val="none"/>
+              <w:right w:val="none"/>
+            </w:tcBorders>
+          </w:tcPr>
+          <w:p>
+            <w:pPr>
+              <w:spacing w:before="40" w:after="40"/>
+            </w:pPr>
+            <w:r>
+              <w:rPr>
+                <w:rFonts w:ascii="Arial" w:hAnsi="Arial"/>
+                <w:b/>
+                <w:color w:val="0A2540"/>
+                <w:sz w:val="20"/>
+              </w:rPr>
+              <w:t xml:space="preserve">📌 RESUMEN DE LA DECISIÓN MADURA: </w:t>
+            </w:r>
+            <w:r>
+              <w:rPr>
+                <w:rFonts w:ascii="Arial" w:hAnsi="Arial"/>
+                <w:color w:val="28323C"/>
+                <w:sz w:val="20"/>
+              </w:rPr>
+              <w:t>“Se protege la confianza del pipeline y la disciplina TBD por encima de la presión comercial de corto plazo. Se comunica con transparencia al stakeholder y se define un camino claro y seguro de liberación.”</w:t>
+            </w:r>
+          </w:p>
+        </w:tc>
+      </w:tr>
+    </w:tbl>
+    <w:p/>
     <w:p>
       <w:pPr>
         <w:pStyle w:val="Heading1"/>
       </w:pPr>
       <w:r>
-        <w:t>5. CONCLUSIONES Y CIERRE</w:t>
+        <w:t>5. REFLEXIÓN PEDAGÓGICA Y CONCLUSIONES</w:t>
       </w:r>
     </w:p>
+    <w:tbl>
+      <w:tblPr>
+        <w:tblW w:type="auto" w:w="0"/>
+        <w:jc w:val="center"/>
+        <w:tblLook w:firstColumn="1" w:firstRow="1" w:lastColumn="0" w:lastRow="0" w:noHBand="0" w:noVBand="1" w:val="04A0"/>
+      </w:tblPr>
+      <w:tblGrid>
+        <w:gridCol w:w="9360"/>
+      </w:tblGrid>
+      <w:tr>
+        <w:tc>
+          <w:tcPr>
+            <w:tcW w:type="dxa" w:w="9360"/>
+            <w:shd w:fill="F5F3FF"/>
+            <w:tcMar>
+              <w:top w:w="140" w:type="dxa"/>
+              <w:bottom w:w="140" w:type="dxa"/>
+              <w:left w:w="200" w:type="dxa"/>
+              <w:right w:w="180" w:type="dxa"/>
+            </w:tcMar>
+            <w:tcBorders>
+              <w:top w:val="none"/>
+              <w:left w:val="single" w:sz="24" w:space="0" w:color="7C3AED"/>
+              <w:bottom w:val="none"/>
+              <w:right w:val="none"/>
+            </w:tcBorders>
+          </w:tcPr>
+          <w:p>
+            <w:pPr>
+              <w:spacing w:before="40" w:after="40"/>
+            </w:pPr>
+            <w:r>
+              <w:rPr>
+                <w:rFonts w:ascii="Arial" w:hAnsi="Arial"/>
+                <w:b/>
+                <w:color w:val="0A2540"/>
+                <w:sz w:val="20"/>
+              </w:rPr>
+              <w:t xml:space="preserve">📌 ANÁLISIS DE COMPLEJIDAD Y NEGOCIACIÓN DEL CASO: </w:t>
+            </w:r>
+            <w:r>
+              <w:rPr>
+                <w:rFonts w:ascii="Arial" w:hAnsi="Arial"/>
+                <w:color w:val="28323C"/>
+                <w:sz w:val="20"/>
+              </w:rPr>
+              <w:t>“Este caso es suficientemente difícil porque combina presión de negocio, deuda técnica, fallos recientes de pipeline, falta de métricas y ruptura de disciplina TBD. Obliga al equipo a negociar, priorizar y aplicar todo lo aprendido en los cuatro talleres.”</w:t>
+            </w:r>
+          </w:p>
+        </w:tc>
+      </w:tr>
+    </w:tbl>
+    <w:p/>
     <w:p>
       <w:r>
-        <w:t>1. El Continuous Deployment exige desacoplar el despliegue técnico (automatizado por el pipeline hacia Render) de la liberación de valor (controlada por el Product Owner mediante ConfigCat).</w:t>
+        <w:t>1. Continuous Deployment exige desacoplar el despliegue técnico (automatizado hacia Render) de la liberación de valor (controlada por el PO en ConfigCat).</w:t>
         <w:br/>
-        <w:t>2. El Sprint Review deja de ser una entrega de fin de ciclo para convertirse en una sesión de validación de valor e hipótesis sobre el entorno de producción real.</w:t>
+        <w:t>2. El Sprint Review valida hipótesis de valor e impacto real con telemetría, no promesas de fin de ciclo.</w:t>
         <w:br/>
-        <w:t>3. La Sprint Retrospective se transforma en un espacio de auditoría del pipeline, asegurando ramas cortas, pruebas estables y eliminación de deuda técnica en toggles.</w:t>
+        <w:t>3. La Sprint Retrospective audita matemáticamente la salud del pipeline y protege las 5 reglas de oro de Trunk-Based Development.</w:t>
       </w:r>
     </w:p>
     <w:tbl>

</xml_diff>